<commit_message>
Update User/Admin Guides to v4.0 and open them in-app instead of downloading
Brings both guides current with everything shipped since v3.0 — reactions,
replies, pins, search, custom emoji, attachments, offline outbox, voice
effects, soundboard, screen share window, voice activity mode, push
notifications, PWA install, friends, theme toggle, the owner role, and
desktop app releases were all previously undocumented.

Also replaces the docx download links with an in-app GuideModal viewer
(sidebar's User Guide, Admin Portal's Admin Guide) so opening the guide
no longer triggers a repeated file download — the .docx stays available
as an optional secondary link for offline/printable copies.
</commit_message>
<xml_diff>
--- a/CrowsNest-Admin-Guide.docx
+++ b/CrowsNest-Admin-Guide.docx
@@ -65,7 +65,7 @@
           <w:sz w:val="20"/>
           <w:szCs w:val="20"/>
         </w:rPr>
-        <w:t xml:space="preserve">Version 3.0  •  August 2026</w:t>
+        <w:t xml:space="preserve">Version 4.0  •  September 2026</w:t>
       </w:r>
     </w:p>
     <w:p>
@@ -1774,97 +1774,274 @@
           </w:p>
         </w:tc>
       </w:tr>
+      <w:tr>
+        <w:tc>
+          <w:tcPr>
+            <w:tcW w:type="dxa" w:w="4400"/>
+            <w:tcBorders>
+              <w:top w:val="single" w:color="DDDDDD" w:sz="1"/>
+              <w:left w:val="single" w:color="DDDDDD" w:sz="1"/>
+              <w:bottom w:val="single" w:color="DDDDDD" w:sz="1"/>
+              <w:right w:val="single" w:color="DDDDDD" w:sz="1"/>
+            </w:tcBorders>
+            <w:shd w:fill="F8F9FF" w:val="clear"/>
+            <w:tcMar>
+              <w:top w:type="dxa" w:w="80"/>
+              <w:left w:type="dxa" w:w="150"/>
+              <w:bottom w:type="dxa" w:w="80"/>
+              <w:right w:type="dxa" w:w="150"/>
+            </w:tcMar>
+          </w:tcPr>
+          <w:p>
+            <w:r>
+              <w:rPr>
+                <w:rFonts w:ascii="Arial" w:cs="Arial" w:eastAsia="Arial" w:hAnsi="Arial"/>
+                <w:color w:val="313338"/>
+                <w:sz w:val="20"/>
+                <w:szCs w:val="20"/>
+              </w:rPr>
+              <w:t xml:space="preserve">Upload / delete custom server emoji</w:t>
+            </w:r>
+          </w:p>
+        </w:tc>
+        <w:tc>
+          <w:tcPr>
+            <w:tcW w:type="dxa" w:w="2480"/>
+            <w:tcBorders>
+              <w:top w:val="single" w:color="DDDDDD" w:sz="1"/>
+              <w:left w:val="single" w:color="DDDDDD" w:sz="1"/>
+              <w:bottom w:val="single" w:color="DDDDDD" w:sz="1"/>
+              <w:right w:val="single" w:color="DDDDDD" w:sz="1"/>
+            </w:tcBorders>
+            <w:shd w:fill="F8F9FF" w:val="clear"/>
+            <w:tcMar>
+              <w:top w:type="dxa" w:w="80"/>
+              <w:left w:type="dxa" w:w="150"/>
+              <w:bottom w:type="dxa" w:w="80"/>
+              <w:right w:type="dxa" w:w="150"/>
+            </w:tcMar>
+          </w:tcPr>
+          <w:p>
+            <w:r>
+              <w:rPr>
+                <w:rFonts w:ascii="Arial" w:cs="Arial" w:eastAsia="Arial" w:hAnsi="Arial"/>
+                <w:color w:val="313338"/>
+                <w:sz w:val="20"/>
+                <w:szCs w:val="20"/>
+              </w:rPr>
+              <w:t xml:space="preserve">No</w:t>
+            </w:r>
+          </w:p>
+        </w:tc>
+        <w:tc>
+          <w:tcPr>
+            <w:tcW w:type="dxa" w:w="2480"/>
+            <w:tcBorders>
+              <w:top w:val="single" w:color="DDDDDD" w:sz="1"/>
+              <w:left w:val="single" w:color="DDDDDD" w:sz="1"/>
+              <w:bottom w:val="single" w:color="DDDDDD" w:sz="1"/>
+              <w:right w:val="single" w:color="DDDDDD" w:sz="1"/>
+            </w:tcBorders>
+            <w:shd w:fill="F8F9FF" w:val="clear"/>
+            <w:tcMar>
+              <w:top w:type="dxa" w:w="80"/>
+              <w:left w:type="dxa" w:w="150"/>
+              <w:bottom w:type="dxa" w:w="80"/>
+              <w:right w:type="dxa" w:w="150"/>
+            </w:tcMar>
+          </w:tcPr>
+          <w:p>
+            <w:r>
+              <w:rPr>
+                <w:rFonts w:ascii="Arial" w:cs="Arial" w:eastAsia="Arial" w:hAnsi="Arial"/>
+                <w:color w:val="313338"/>
+                <w:sz w:val="20"/>
+                <w:szCs w:val="20"/>
+              </w:rPr>
+              <w:t xml:space="preserve">Yes</w:t>
+            </w:r>
+          </w:p>
+        </w:tc>
+      </w:tr>
+      <w:tr>
+        <w:tc>
+          <w:tcPr>
+            <w:tcW w:type="dxa" w:w="4400"/>
+            <w:tcBorders>
+              <w:top w:val="single" w:color="DDDDDD" w:sz="1"/>
+              <w:left w:val="single" w:color="DDDDDD" w:sz="1"/>
+              <w:bottom w:val="single" w:color="DDDDDD" w:sz="1"/>
+              <w:right w:val="single" w:color="DDDDDD" w:sz="1"/>
+            </w:tcBorders>
+            <w:shd w:fill="FFFFFF" w:val="clear"/>
+            <w:tcMar>
+              <w:top w:type="dxa" w:w="80"/>
+              <w:left w:type="dxa" w:w="150"/>
+              <w:bottom w:type="dxa" w:w="80"/>
+              <w:right w:type="dxa" w:w="150"/>
+            </w:tcMar>
+          </w:tcPr>
+          <w:p>
+            <w:r>
+              <w:rPr>
+                <w:rFonts w:ascii="Arial" w:cs="Arial" w:eastAsia="Arial" w:hAnsi="Arial"/>
+                <w:color w:val="313338"/>
+                <w:sz w:val="20"/>
+                <w:szCs w:val="20"/>
+              </w:rPr>
+              <w:t xml:space="preserve">Upload / delete soundboard clips</w:t>
+            </w:r>
+          </w:p>
+        </w:tc>
+        <w:tc>
+          <w:tcPr>
+            <w:tcW w:type="dxa" w:w="2480"/>
+            <w:tcBorders>
+              <w:top w:val="single" w:color="DDDDDD" w:sz="1"/>
+              <w:left w:val="single" w:color="DDDDDD" w:sz="1"/>
+              <w:bottom w:val="single" w:color="DDDDDD" w:sz="1"/>
+              <w:right w:val="single" w:color="DDDDDD" w:sz="1"/>
+            </w:tcBorders>
+            <w:shd w:fill="FFFFFF" w:val="clear"/>
+            <w:tcMar>
+              <w:top w:type="dxa" w:w="80"/>
+              <w:left w:type="dxa" w:w="150"/>
+              <w:bottom w:type="dxa" w:w="80"/>
+              <w:right w:type="dxa" w:w="150"/>
+            </w:tcMar>
+          </w:tcPr>
+          <w:p>
+            <w:r>
+              <w:rPr>
+                <w:rFonts w:ascii="Arial" w:cs="Arial" w:eastAsia="Arial" w:hAnsi="Arial"/>
+                <w:color w:val="313338"/>
+                <w:sz w:val="20"/>
+                <w:szCs w:val="20"/>
+              </w:rPr>
+              <w:t xml:space="preserve">No</w:t>
+            </w:r>
+          </w:p>
+        </w:tc>
+        <w:tc>
+          <w:tcPr>
+            <w:tcW w:type="dxa" w:w="2480"/>
+            <w:tcBorders>
+              <w:top w:val="single" w:color="DDDDDD" w:sz="1"/>
+              <w:left w:val="single" w:color="DDDDDD" w:sz="1"/>
+              <w:bottom w:val="single" w:color="DDDDDD" w:sz="1"/>
+              <w:right w:val="single" w:color="DDDDDD" w:sz="1"/>
+            </w:tcBorders>
+            <w:shd w:fill="FFFFFF" w:val="clear"/>
+            <w:tcMar>
+              <w:top w:type="dxa" w:w="80"/>
+              <w:left w:type="dxa" w:w="150"/>
+              <w:bottom w:type="dxa" w:w="80"/>
+              <w:right w:type="dxa" w:w="150"/>
+            </w:tcMar>
+          </w:tcPr>
+          <w:p>
+            <w:r>
+              <w:rPr>
+                <w:rFonts w:ascii="Arial" w:cs="Arial" w:eastAsia="Arial" w:hAnsi="Arial"/>
+                <w:color w:val="313338"/>
+                <w:sz w:val="20"/>
+                <w:szCs w:val="20"/>
+              </w:rPr>
+              <w:t xml:space="preserve">Yes</w:t>
+            </w:r>
+          </w:p>
+        </w:tc>
+      </w:tr>
+      <w:tr>
+        <w:tc>
+          <w:tcPr>
+            <w:tcW w:type="dxa" w:w="4400"/>
+            <w:tcBorders>
+              <w:top w:val="single" w:color="DDDDDD" w:sz="1"/>
+              <w:left w:val="single" w:color="DDDDDD" w:sz="1"/>
+              <w:bottom w:val="single" w:color="DDDDDD" w:sz="1"/>
+              <w:right w:val="single" w:color="DDDDDD" w:sz="1"/>
+            </w:tcBorders>
+            <w:shd w:fill="F8F9FF" w:val="clear"/>
+            <w:tcMar>
+              <w:top w:type="dxa" w:w="80"/>
+              <w:left w:type="dxa" w:w="150"/>
+              <w:bottom w:type="dxa" w:w="80"/>
+              <w:right w:type="dxa" w:w="150"/>
+            </w:tcMar>
+          </w:tcPr>
+          <w:p>
+            <w:r>
+              <w:rPr>
+                <w:rFonts w:ascii="Arial" w:cs="Arial" w:eastAsia="Arial" w:hAnsi="Arial"/>
+                <w:color w:val="313338"/>
+                <w:sz w:val="20"/>
+                <w:szCs w:val="20"/>
+              </w:rPr>
+              <w:t xml:space="preserve">Change server icon / category labels</w:t>
+            </w:r>
+          </w:p>
+        </w:tc>
+        <w:tc>
+          <w:tcPr>
+            <w:tcW w:type="dxa" w:w="2480"/>
+            <w:tcBorders>
+              <w:top w:val="single" w:color="DDDDDD" w:sz="1"/>
+              <w:left w:val="single" w:color="DDDDDD" w:sz="1"/>
+              <w:bottom w:val="single" w:color="DDDDDD" w:sz="1"/>
+              <w:right w:val="single" w:color="DDDDDD" w:sz="1"/>
+            </w:tcBorders>
+            <w:shd w:fill="F8F9FF" w:val="clear"/>
+            <w:tcMar>
+              <w:top w:type="dxa" w:w="80"/>
+              <w:left w:type="dxa" w:w="150"/>
+              <w:bottom w:type="dxa" w:w="80"/>
+              <w:right w:type="dxa" w:w="150"/>
+            </w:tcMar>
+          </w:tcPr>
+          <w:p>
+            <w:r>
+              <w:rPr>
+                <w:rFonts w:ascii="Arial" w:cs="Arial" w:eastAsia="Arial" w:hAnsi="Arial"/>
+                <w:color w:val="313338"/>
+                <w:sz w:val="20"/>
+                <w:szCs w:val="20"/>
+              </w:rPr>
+              <w:t xml:space="preserve">No</w:t>
+            </w:r>
+          </w:p>
+        </w:tc>
+        <w:tc>
+          <w:tcPr>
+            <w:tcW w:type="dxa" w:w="2480"/>
+            <w:tcBorders>
+              <w:top w:val="single" w:color="DDDDDD" w:sz="1"/>
+              <w:left w:val="single" w:color="DDDDDD" w:sz="1"/>
+              <w:bottom w:val="single" w:color="DDDDDD" w:sz="1"/>
+              <w:right w:val="single" w:color="DDDDDD" w:sz="1"/>
+            </w:tcBorders>
+            <w:shd w:fill="F8F9FF" w:val="clear"/>
+            <w:tcMar>
+              <w:top w:type="dxa" w:w="80"/>
+              <w:left w:type="dxa" w:w="150"/>
+              <w:bottom w:type="dxa" w:w="80"/>
+              <w:right w:type="dxa" w:w="150"/>
+            </w:tcMar>
+          </w:tcPr>
+          <w:p>
+            <w:r>
+              <w:rPr>
+                <w:rFonts w:ascii="Arial" w:cs="Arial" w:eastAsia="Arial" w:hAnsi="Arial"/>
+                <w:color w:val="313338"/>
+                <w:sz w:val="20"/>
+                <w:szCs w:val="20"/>
+              </w:rPr>
+              <w:t xml:space="preserve">Yes</w:t>
+            </w:r>
+          </w:p>
+        </w:tc>
+      </w:tr>
     </w:tbl>
-    <w:p>
-      <w:pPr>
-        <w:spacing w:after="160"/>
-      </w:pPr>
-    </w:p>
-    <w:p>
-      <w:pPr>
-        <w:pStyle w:val="Heading2"/>
-        <w:spacing w:after="120" w:before="280"/>
-      </w:pPr>
-      <w:r>
-        <w:rPr>
-          <w:rFonts w:ascii="Arial" w:cs="Arial" w:eastAsia="Arial" w:hAnsi="Arial"/>
-          <w:b/>
-          <w:bCs/>
-          <w:color w:val="5865F2"/>
-          <w:sz w:val="24"/>
-          <w:szCs w:val="24"/>
-        </w:rPr>
-        <w:t xml:space="preserve">1.2 Accessing Admin Settings</w:t>
-      </w:r>
-    </w:p>
-    <w:p>
-      <w:pPr>
-        <w:spacing w:after="120"/>
-      </w:pPr>
-      <w:r>
-        <w:rPr>
-          <w:rFonts w:ascii="Arial" w:cs="Arial" w:eastAsia="Arial" w:hAnsi="Arial"/>
-          <w:color w:val="313338"/>
-          <w:sz w:val="22"/>
-          <w:szCs w:val="22"/>
-        </w:rPr>
-        <w:t xml:space="preserve">The Admin Settings panel is only visible to users with the admin role. To open it:</w:t>
-      </w:r>
-    </w:p>
-    <w:p>
-      <w:pPr>
-        <w:pStyle w:val="ListParagraph"/>
-        <w:numPr>
-          <w:ilvl w:val="0"/>
-          <w:numId w:val="2"/>
-        </w:numPr>
-        <w:spacing w:after="80"/>
-      </w:pPr>
-      <w:r>
-        <w:rPr>
-          <w:rFonts w:ascii="Arial" w:cs="Arial" w:eastAsia="Arial" w:hAnsi="Arial"/>
-          <w:sz w:val="22"/>
-          <w:szCs w:val="22"/>
-        </w:rPr>
-        <w:t xml:space="preserve">Log in with your admin account</w:t>
-      </w:r>
-    </w:p>
-    <w:p>
-      <w:pPr>
-        <w:pStyle w:val="ListParagraph"/>
-        <w:numPr>
-          <w:ilvl w:val="0"/>
-          <w:numId w:val="2"/>
-        </w:numPr>
-        <w:spacing w:after="80"/>
-      </w:pPr>
-      <w:r>
-        <w:rPr>
-          <w:rFonts w:ascii="Arial" w:cs="Arial" w:eastAsia="Arial" w:hAnsi="Arial"/>
-          <w:sz w:val="22"/>
-          <w:szCs w:val="22"/>
-        </w:rPr>
-        <w:t xml:space="preserve">Click the gear icon (Settings) in the bottom-left sidebar</w:t>
-      </w:r>
-    </w:p>
-    <w:p>
-      <w:pPr>
-        <w:pStyle w:val="ListParagraph"/>
-        <w:numPr>
-          <w:ilvl w:val="0"/>
-          <w:numId w:val="2"/>
-        </w:numPr>
-        <w:spacing w:after="80"/>
-      </w:pPr>
-      <w:r>
-        <w:rPr>
-          <w:rFonts w:ascii="Arial" w:cs="Arial" w:eastAsia="Arial" w:hAnsi="Arial"/>
-          <w:sz w:val="22"/>
-          <w:szCs w:val="22"/>
-        </w:rPr>
-        <w:t xml:space="preserve">The panel opens with four tabs: Server, Channels, Games, and Users</w:t>
-      </w:r>
-    </w:p>
     <w:p>
       <w:pPr>
         <w:spacing w:after="80"/>
@@ -1895,6 +2072,162 @@
               <w:bottom w:val="none" w:color="FFFFFF" w:sz="0"/>
               <w:right w:val="none" w:color="FFFFFF" w:sz="0"/>
             </w:tcBorders>
+            <w:shd w:fill="EEF0FF" w:val="clear"/>
+            <w:tcMar>
+              <w:top w:type="dxa" w:w="120"/>
+              <w:left w:type="dxa" w:w="200"/>
+              <w:bottom w:type="dxa" w:w="120"/>
+              <w:right w:type="dxa" w:w="200"/>
+            </w:tcMar>
+          </w:tcPr>
+          <w:p>
+            <w:pPr>
+              <w:spacing w:after="0"/>
+            </w:pPr>
+            <w:r>
+              <w:rPr>
+                <w:rFonts w:ascii="Arial" w:cs="Arial" w:eastAsia="Arial" w:hAnsi="Arial"/>
+                <w:b/>
+                <w:bCs/>
+                <w:color w:val="5865F2"/>
+                <w:sz w:val="22"/>
+                <w:szCs w:val="22"/>
+              </w:rPr>
+              <w:t xml:space="preserve">NOTE: </w:t>
+            </w:r>
+            <w:r>
+              <w:rPr>
+                <w:rFonts w:ascii="Arial" w:cs="Arial" w:eastAsia="Arial" w:hAnsi="Arial"/>
+                <w:color w:val="313338"/>
+                <w:sz w:val="22"/>
+                <w:szCs w:val="22"/>
+              </w:rPr>
+              <w:t xml:space="preserve">One admin can additionally hold the Owner flag — see Section 7.7. It doesn’t unlock new actions, but it protects that account from being demoted or removed by other admins.</w:t>
+            </w:r>
+          </w:p>
+        </w:tc>
+      </w:tr>
+    </w:tbl>
+    <w:p>
+      <w:pPr>
+        <w:spacing w:after="160"/>
+      </w:pPr>
+    </w:p>
+    <w:p>
+      <w:pPr>
+        <w:pStyle w:val="Heading2"/>
+        <w:spacing w:after="120" w:before="280"/>
+      </w:pPr>
+      <w:r>
+        <w:rPr>
+          <w:rFonts w:ascii="Arial" w:cs="Arial" w:eastAsia="Arial" w:hAnsi="Arial"/>
+          <w:b/>
+          <w:bCs/>
+          <w:color w:val="5865F2"/>
+          <w:sz w:val="24"/>
+          <w:szCs w:val="24"/>
+        </w:rPr>
+        <w:t xml:space="preserve">1.2 Accessing Admin Settings</w:t>
+      </w:r>
+    </w:p>
+    <w:p>
+      <w:pPr>
+        <w:spacing w:after="120"/>
+      </w:pPr>
+      <w:r>
+        <w:rPr>
+          <w:rFonts w:ascii="Arial" w:cs="Arial" w:eastAsia="Arial" w:hAnsi="Arial"/>
+          <w:color w:val="313338"/>
+          <w:sz w:val="22"/>
+          <w:szCs w:val="22"/>
+        </w:rPr>
+        <w:t xml:space="preserve">The Admin Settings panel is only visible to users with the admin role. To open it:</w:t>
+      </w:r>
+    </w:p>
+    <w:p>
+      <w:pPr>
+        <w:pStyle w:val="ListParagraph"/>
+        <w:numPr>
+          <w:ilvl w:val="0"/>
+          <w:numId w:val="2"/>
+        </w:numPr>
+        <w:spacing w:after="80"/>
+      </w:pPr>
+      <w:r>
+        <w:rPr>
+          <w:rFonts w:ascii="Arial" w:cs="Arial" w:eastAsia="Arial" w:hAnsi="Arial"/>
+          <w:sz w:val="22"/>
+          <w:szCs w:val="22"/>
+        </w:rPr>
+        <w:t xml:space="preserve">Log in with your admin account</w:t>
+      </w:r>
+    </w:p>
+    <w:p>
+      <w:pPr>
+        <w:pStyle w:val="ListParagraph"/>
+        <w:numPr>
+          <w:ilvl w:val="0"/>
+          <w:numId w:val="2"/>
+        </w:numPr>
+        <w:spacing w:after="80"/>
+      </w:pPr>
+      <w:r>
+        <w:rPr>
+          <w:rFonts w:ascii="Arial" w:cs="Arial" w:eastAsia="Arial" w:hAnsi="Arial"/>
+          <w:sz w:val="22"/>
+          <w:szCs w:val="22"/>
+        </w:rPr>
+        <w:t xml:space="preserve">Click the gear icon (Settings) in the bottom-left sidebar</w:t>
+      </w:r>
+    </w:p>
+    <w:p>
+      <w:pPr>
+        <w:pStyle w:val="ListParagraph"/>
+        <w:numPr>
+          <w:ilvl w:val="0"/>
+          <w:numId w:val="2"/>
+        </w:numPr>
+        <w:spacing w:after="80"/>
+      </w:pPr>
+      <w:r>
+        <w:rPr>
+          <w:rFonts w:ascii="Arial" w:cs="Arial" w:eastAsia="Arial" w:hAnsi="Arial"/>
+          <w:sz w:val="22"/>
+          <w:szCs w:val="22"/>
+        </w:rPr>
+        <w:t xml:space="preserve">The panel opens with six tabs: Server, Channels, Games, Custom Emoji, Soundboard, and Users</w:t>
+      </w:r>
+    </w:p>
+    <w:p>
+      <w:pPr>
+        <w:spacing w:after="80"/>
+      </w:pPr>
+    </w:p>
+    <w:tbl>
+      <w:tblPr>
+        <w:tblW w:type="dxa" w:w="9360"/>
+        <w:tblBorders>
+          <w:top w:val="single" w:color="auto" w:sz="4"/>
+          <w:left w:val="single" w:color="auto" w:sz="4"/>
+          <w:bottom w:val="single" w:color="auto" w:sz="4"/>
+          <w:right w:val="single" w:color="auto" w:sz="4"/>
+          <w:insideH w:val="single" w:color="auto" w:sz="4"/>
+          <w:insideV w:val="single" w:color="auto" w:sz="4"/>
+        </w:tblBorders>
+      </w:tblPr>
+      <w:tblGrid>
+        <w:gridCol w:w="9360"/>
+      </w:tblGrid>
+      <w:tr>
+        <w:tc>
+          <w:tcPr>
+            <w:tcW w:type="dxa" w:w="9360"/>
+            <w:tcBorders>
+              <w:top w:val="none" w:color="FFFFFF" w:sz="0"/>
+              <w:left w:val="none" w:color="FFFFFF" w:sz="0"/>
+              <w:bottom w:val="none" w:color="FFFFFF" w:sz="0"/>
+              <w:right w:val="none" w:color="FFFFFF" w:sz="0"/>
+            </w:tcBorders>
             <w:shd w:fill="FFF8E1" w:val="clear"/>
             <w:tcMar>
               <w:top w:type="dxa" w:w="120"/>
@@ -1964,7 +2297,7 @@
           <w:sz w:val="22"/>
           <w:szCs w:val="22"/>
         </w:rPr>
-        <w:t xml:space="preserve">A shield icon above the gear icon opens the full standalone Admin Portal — a separate dashboard at the admin. subdomain with deeper server management tools. In the desktop app it opens in its own window; in a browser it opens in a new tab. It has six sections in its sidebar:</w:t>
+        <w:t xml:space="preserve">A shield icon above the gear icon opens the full standalone Admin Portal — a separate dashboard at the admin. subdomain with deeper server management tools. In the desktop app it opens in its own window; in a browser it opens in a new tab. It has eight sections in its sidebar:</w:t>
       </w:r>
     </w:p>
     <w:p>
@@ -2178,7 +2511,7 @@
                 <w:sz w:val="20"/>
                 <w:szCs w:val="20"/>
               </w:rPr>
-              <w:t xml:space="preserve">Search, promote/demote, force a password reset, set a password directly, or remove a user.</w:t>
+              <w:t xml:space="preserve">Search, promote/demote, force a password reset, set a password directly, transfer the Owner flag, or remove a user.</w:t>
             </w:r>
           </w:p>
         </w:tc>
@@ -2329,7 +2662,7 @@
                 <w:sz w:val="20"/>
                 <w:szCs w:val="20"/>
               </w:rPr>
-              <w:t xml:space="preserve">Recent Messages</w:t>
+              <w:t xml:space="preserve">Custom Emoji</w:t>
             </w:r>
           </w:p>
         </w:tc>
@@ -2358,7 +2691,7 @@
                 <w:sz w:val="20"/>
                 <w:szCs w:val="20"/>
               </w:rPr>
-              <w:t xml:space="preserve">Search the last 100 messages sent across every channel.</w:t>
+              <w:t xml:space="preserve">Upload or delete the server’s custom :name: emoji.</w:t>
             </w:r>
           </w:p>
         </w:tc>
@@ -2389,6 +2722,126 @@
                 <w:sz w:val="20"/>
                 <w:szCs w:val="20"/>
               </w:rPr>
+              <w:t xml:space="preserve">Soundboard</w:t>
+            </w:r>
+          </w:p>
+        </w:tc>
+        <w:tc>
+          <w:tcPr>
+            <w:tcW w:type="dxa" w:w="6960"/>
+            <w:tcBorders>
+              <w:top w:val="single" w:color="DDDDDD" w:sz="1"/>
+              <w:left w:val="single" w:color="DDDDDD" w:sz="1"/>
+              <w:bottom w:val="single" w:color="DDDDDD" w:sz="1"/>
+              <w:right w:val="single" w:color="DDDDDD" w:sz="1"/>
+            </w:tcBorders>
+            <w:shd w:fill="F8F9FF" w:val="clear"/>
+            <w:tcMar>
+              <w:top w:type="dxa" w:w="80"/>
+              <w:left w:type="dxa" w:w="150"/>
+              <w:bottom w:type="dxa" w:w="80"/>
+              <w:right w:type="dxa" w:w="150"/>
+            </w:tcMar>
+          </w:tcPr>
+          <w:p>
+            <w:r>
+              <w:rPr>
+                <w:rFonts w:ascii="Arial" w:cs="Arial" w:eastAsia="Arial" w:hAnsi="Arial"/>
+                <w:color w:val="313338"/>
+                <w:sz w:val="20"/>
+                <w:szCs w:val="20"/>
+              </w:rPr>
+              <w:t xml:space="preserve">Upload or delete the clips available in every voice channel’s Soundboard panel.</w:t>
+            </w:r>
+          </w:p>
+        </w:tc>
+      </w:tr>
+      <w:tr>
+        <w:tc>
+          <w:tcPr>
+            <w:tcW w:type="dxa" w:w="2400"/>
+            <w:tcBorders>
+              <w:top w:val="single" w:color="DDDDDD" w:sz="1"/>
+              <w:left w:val="single" w:color="DDDDDD" w:sz="1"/>
+              <w:bottom w:val="single" w:color="DDDDDD" w:sz="1"/>
+              <w:right w:val="single" w:color="DDDDDD" w:sz="1"/>
+            </w:tcBorders>
+            <w:shd w:fill="FFFFFF" w:val="clear"/>
+            <w:tcMar>
+              <w:top w:type="dxa" w:w="80"/>
+              <w:left w:type="dxa" w:w="150"/>
+              <w:bottom w:type="dxa" w:w="80"/>
+              <w:right w:type="dxa" w:w="150"/>
+            </w:tcMar>
+          </w:tcPr>
+          <w:p>
+            <w:r>
+              <w:rPr>
+                <w:rFonts w:ascii="Arial" w:cs="Arial" w:eastAsia="Arial" w:hAnsi="Arial"/>
+                <w:color w:val="313338"/>
+                <w:sz w:val="20"/>
+                <w:szCs w:val="20"/>
+              </w:rPr>
+              <w:t xml:space="preserve">Recent Messages</w:t>
+            </w:r>
+          </w:p>
+        </w:tc>
+        <w:tc>
+          <w:tcPr>
+            <w:tcW w:type="dxa" w:w="6960"/>
+            <w:tcBorders>
+              <w:top w:val="single" w:color="DDDDDD" w:sz="1"/>
+              <w:left w:val="single" w:color="DDDDDD" w:sz="1"/>
+              <w:bottom w:val="single" w:color="DDDDDD" w:sz="1"/>
+              <w:right w:val="single" w:color="DDDDDD" w:sz="1"/>
+            </w:tcBorders>
+            <w:shd w:fill="FFFFFF" w:val="clear"/>
+            <w:tcMar>
+              <w:top w:type="dxa" w:w="80"/>
+              <w:left w:type="dxa" w:w="150"/>
+              <w:bottom w:type="dxa" w:w="80"/>
+              <w:right w:type="dxa" w:w="150"/>
+            </w:tcMar>
+          </w:tcPr>
+          <w:p>
+            <w:r>
+              <w:rPr>
+                <w:rFonts w:ascii="Arial" w:cs="Arial" w:eastAsia="Arial" w:hAnsi="Arial"/>
+                <w:color w:val="313338"/>
+                <w:sz w:val="20"/>
+                <w:szCs w:val="20"/>
+              </w:rPr>
+              <w:t xml:space="preserve">Search the last 100 messages sent across every channel.</w:t>
+            </w:r>
+          </w:p>
+        </w:tc>
+      </w:tr>
+      <w:tr>
+        <w:tc>
+          <w:tcPr>
+            <w:tcW w:type="dxa" w:w="2400"/>
+            <w:tcBorders>
+              <w:top w:val="single" w:color="DDDDDD" w:sz="1"/>
+              <w:left w:val="single" w:color="DDDDDD" w:sz="1"/>
+              <w:bottom w:val="single" w:color="DDDDDD" w:sz="1"/>
+              <w:right w:val="single" w:color="DDDDDD" w:sz="1"/>
+            </w:tcBorders>
+            <w:shd w:fill="F8F9FF" w:val="clear"/>
+            <w:tcMar>
+              <w:top w:type="dxa" w:w="80"/>
+              <w:left w:type="dxa" w:w="150"/>
+              <w:bottom w:type="dxa" w:w="80"/>
+              <w:right w:type="dxa" w:w="150"/>
+            </w:tcMar>
+          </w:tcPr>
+          <w:p>
+            <w:r>
+              <w:rPr>
+                <w:rFonts w:ascii="Arial" w:cs="Arial" w:eastAsia="Arial" w:hAnsi="Arial"/>
+                <w:color w:val="313338"/>
+                <w:sz w:val="20"/>
+                <w:szCs w:val="20"/>
+              </w:rPr>
               <w:t xml:space="preserve">Server Settings</w:t>
             </w:r>
           </w:p>
@@ -2418,7 +2871,7 @@
                 <w:sz w:val="20"/>
                 <w:szCs w:val="20"/>
               </w:rPr>
-              <w:t xml:space="preserve">Rename the server and edit its description.</w:t>
+              <w:t xml:space="preserve">Rename the server, edit its description, change its icon, and rename the channel category labels.</w:t>
             </w:r>
           </w:p>
         </w:tc>
@@ -3020,6 +3473,78 @@
           <w:szCs w:val="22"/>
         </w:rPr>
         <w:t xml:space="preserve">Click Save Changes — the new name appears immediately in the sidebar for all users</w:t>
+      </w:r>
+    </w:p>
+    <w:p>
+      <w:pPr>
+        <w:spacing w:after="160"/>
+      </w:pPr>
+    </w:p>
+    <w:p>
+      <w:pPr>
+        <w:pStyle w:val="Heading2"/>
+        <w:spacing w:after="120" w:before="280"/>
+      </w:pPr>
+      <w:r>
+        <w:rPr>
+          <w:rFonts w:ascii="Arial" w:cs="Arial" w:eastAsia="Arial" w:hAnsi="Arial"/>
+          <w:b/>
+          <w:bCs/>
+          <w:color w:val="5865F2"/>
+          <w:sz w:val="24"/>
+          <w:szCs w:val="24"/>
+        </w:rPr>
+        <w:t xml:space="preserve">3.2 Server Icon</w:t>
+      </w:r>
+    </w:p>
+    <w:p>
+      <w:pPr>
+        <w:spacing w:after="120"/>
+      </w:pPr>
+      <w:r>
+        <w:rPr>
+          <w:rFonts w:ascii="Arial" w:cs="Arial" w:eastAsia="Arial" w:hAnsi="Arial"/>
+          <w:color w:val="313338"/>
+          <w:sz w:val="22"/>
+          <w:szCs w:val="22"/>
+        </w:rPr>
+        <w:t xml:space="preserve">In the same Server Settings tab, click Change Icon under SERVER ICON to upload an image, or Remove to go back to the default lettered icon. It appears in the sidebar for everyone.</w:t>
+      </w:r>
+    </w:p>
+    <w:p>
+      <w:pPr>
+        <w:spacing w:after="160"/>
+      </w:pPr>
+    </w:p>
+    <w:p>
+      <w:pPr>
+        <w:pStyle w:val="Heading2"/>
+        <w:spacing w:after="120" w:before="280"/>
+      </w:pPr>
+      <w:r>
+        <w:rPr>
+          <w:rFonts w:ascii="Arial" w:cs="Arial" w:eastAsia="Arial" w:hAnsi="Arial"/>
+          <w:b/>
+          <w:bCs/>
+          <w:color w:val="5865F2"/>
+          <w:sz w:val="24"/>
+          <w:szCs w:val="24"/>
+        </w:rPr>
+        <w:t xml:space="preserve">3.3 Renaming the Channel Category Labels</w:t>
+      </w:r>
+    </w:p>
+    <w:p>
+      <w:pPr>
+        <w:spacing w:after="120"/>
+      </w:pPr>
+      <w:r>
+        <w:rPr>
+          <w:rFonts w:ascii="Arial" w:cs="Arial" w:eastAsia="Arial" w:hAnsi="Arial"/>
+          <w:color w:val="313338"/>
+          <w:sz w:val="22"/>
+          <w:szCs w:val="22"/>
+        </w:rPr>
+        <w:t xml:space="preserve">The TEXT CHANNELS SECTION LABEL and VOICE CHANNELS SECTION LABEL fields (same Server Settings tab) let you rename those two category headings in the sidebar to whatever you like — leave blank to use the defaults.</w:t>
       </w:r>
     </w:p>
     <w:p>
@@ -4923,46 +5448,7 @@
     </w:tbl>
     <w:p>
       <w:pPr>
-        <w:spacing w:after="200"/>
-      </w:pPr>
-    </w:p>
-    <w:p>
-      <w:pPr>
-        <w:pStyle w:val="Heading1"/>
-        <w:pBdr>
-          <w:bottom w:val="single" w:color="5865F2" w:sz="4" w:space="6"/>
-        </w:pBdr>
-        <w:spacing w:after="160" w:before="360"/>
-      </w:pPr>
-      <w:r>
-        <w:rPr>
-          <w:rFonts w:ascii="Arial" w:cs="Arial" w:eastAsia="Arial" w:hAnsi="Arial"/>
-          <w:b/>
-          <w:bCs/>
-          <w:color w:val="1E1F22"/>
-          <w:sz w:val="28"/>
-          <w:szCs w:val="28"/>
-        </w:rPr>
-        <w:t xml:space="preserve">8. Voice Channel Admin Controls</w:t>
-      </w:r>
-    </w:p>
-    <w:p>
-      <w:pPr>
-        <w:spacing w:after="120"/>
-      </w:pPr>
-      <w:r>
-        <w:rPr>
-          <w:rFonts w:ascii="Arial" w:cs="Arial" w:eastAsia="Arial" w:hAnsi="Arial"/>
-          <w:color w:val="313338"/>
-          <w:sz w:val="22"/>
-          <w:szCs w:val="22"/>
-        </w:rPr>
-        <w:t xml:space="preserve">When you join a voice channel as an admin, an In Voice panel appears below the room showing all connected participants.</w:t>
-      </w:r>
-    </w:p>
-    <w:p>
-      <w:pPr>
-        <w:spacing w:after="80"/>
+        <w:spacing w:after="160"/>
       </w:pPr>
     </w:p>
     <w:p>
@@ -4979,17 +5465,12 @@
           <w:sz w:val="24"/>
           <w:szCs w:val="24"/>
         </w:rPr>
-        <w:t xml:space="preserve">8.1 Muting and Unmuting Participants</w:t>
-      </w:r>
-    </w:p>
-    <w:p>
-      <w:pPr>
-        <w:pStyle w:val="ListParagraph"/>
-        <w:numPr>
-          <w:ilvl w:val="0"/>
-          <w:numId w:val="3"/>
-        </w:numPr>
-        <w:spacing w:after="80"/>
+        <w:t xml:space="preserve">7.7 The Owner Role</w:t>
+      </w:r>
+    </w:p>
+    <w:p>
+      <w:pPr>
+        <w:spacing w:after="120"/>
       </w:pPr>
       <w:r>
         <w:rPr>
@@ -4998,202 +5479,7 @@
           <w:sz w:val="22"/>
           <w:szCs w:val="22"/>
         </w:rPr>
-        <w:t xml:space="preserve">Each participant shows a microphone icon (green = active, red = muted)</w:t>
-      </w:r>
-    </w:p>
-    <w:p>
-      <w:pPr>
-        <w:pStyle w:val="ListParagraph"/>
-        <w:numPr>
-          <w:ilvl w:val="0"/>
-          <w:numId w:val="3"/>
-        </w:numPr>
-        <w:spacing w:after="80"/>
-      </w:pPr>
-      <w:r>
-        <w:rPr>
-          <w:rFonts w:ascii="Arial" w:cs="Arial" w:eastAsia="Arial" w:hAnsi="Arial"/>
-          <w:color w:val="313338"/>
-          <w:sz w:val="22"/>
-          <w:szCs w:val="22"/>
-        </w:rPr>
-        <w:t xml:space="preserve">Click the mic icon to toggle their server-side mute state — this affects what everyone in the room hears, not just you</w:t>
-      </w:r>
-    </w:p>
-    <w:p>
-      <w:pPr>
-        <w:pStyle w:val="ListParagraph"/>
-        <w:numPr>
-          <w:ilvl w:val="0"/>
-          <w:numId w:val="3"/>
-        </w:numPr>
-        <w:spacing w:after="80"/>
-      </w:pPr>
-      <w:r>
-        <w:rPr>
-          <w:rFonts w:ascii="Arial" w:cs="Arial" w:eastAsia="Arial" w:hAnsi="Arial"/>
-          <w:color w:val="313338"/>
-          <w:sz w:val="22"/>
-          <w:szCs w:val="22"/>
-        </w:rPr>
-        <w:t xml:space="preserve">Click again to unmute them</w:t>
-      </w:r>
-    </w:p>
-    <w:p>
-      <w:pPr>
-        <w:spacing w:after="160"/>
-      </w:pPr>
-    </w:p>
-    <w:p>
-      <w:pPr>
-        <w:pStyle w:val="Heading2"/>
-        <w:spacing w:after="120" w:before="280"/>
-      </w:pPr>
-      <w:r>
-        <w:rPr>
-          <w:rFonts w:ascii="Arial" w:cs="Arial" w:eastAsia="Arial" w:hAnsi="Arial"/>
-          <w:b/>
-          <w:bCs/>
-          <w:color w:val="5865F2"/>
-          <w:sz w:val="24"/>
-          <w:szCs w:val="24"/>
-        </w:rPr>
-        <w:t xml:space="preserve">8.2 Removing a Participant from Voice</w:t>
-      </w:r>
-    </w:p>
-    <w:p>
-      <w:pPr>
-        <w:pStyle w:val="ListParagraph"/>
-        <w:numPr>
-          <w:ilvl w:val="0"/>
-          <w:numId w:val="3"/>
-        </w:numPr>
-        <w:spacing w:after="80"/>
-      </w:pPr>
-      <w:r>
-        <w:rPr>
-          <w:rFonts w:ascii="Arial" w:cs="Arial" w:eastAsia="Arial" w:hAnsi="Arial"/>
-          <w:color w:val="313338"/>
-          <w:sz w:val="22"/>
-          <w:szCs w:val="22"/>
-        </w:rPr>
-        <w:t xml:space="preserve">Click the remove icon next to a participant and confirm — they are immediately disconnected</w:t>
-      </w:r>
-    </w:p>
-    <w:p>
-      <w:pPr>
-        <w:pStyle w:val="ListParagraph"/>
-        <w:numPr>
-          <w:ilvl w:val="0"/>
-          <w:numId w:val="3"/>
-        </w:numPr>
-        <w:spacing w:after="80"/>
-      </w:pPr>
-      <w:r>
-        <w:rPr>
-          <w:rFonts w:ascii="Arial" w:cs="Arial" w:eastAsia="Arial" w:hAnsi="Arial"/>
-          <w:color w:val="313338"/>
-          <w:sz w:val="22"/>
-          <w:szCs w:val="22"/>
-        </w:rPr>
-        <w:t xml:space="preserve">They can rejoin by clicking Join Voice again</w:t>
-      </w:r>
-    </w:p>
-    <w:p>
-      <w:pPr>
-        <w:spacing w:after="160"/>
-      </w:pPr>
-    </w:p>
-    <w:p>
-      <w:pPr>
-        <w:pStyle w:val="Heading2"/>
-        <w:spacing w:after="120" w:before="280"/>
-      </w:pPr>
-      <w:r>
-        <w:rPr>
-          <w:rFonts w:ascii="Arial" w:cs="Arial" w:eastAsia="Arial" w:hAnsi="Arial"/>
-          <w:b/>
-          <w:bCs/>
-          <w:color w:val="5865F2"/>
-          <w:sz w:val="24"/>
-          <w:szCs w:val="24"/>
-        </w:rPr>
-        <w:t xml:space="preserve">8.3 Volume Mixer (All Users)</w:t>
-      </w:r>
-    </w:p>
-    <w:p>
-      <w:pPr>
-        <w:spacing w:after="120"/>
-      </w:pPr>
-      <w:r>
-        <w:rPr>
-          <w:rFonts w:ascii="Arial" w:cs="Arial" w:eastAsia="Arial" w:hAnsi="Arial"/>
-          <w:color w:val="313338"/>
-          <w:sz w:val="22"/>
-          <w:szCs w:val="22"/>
-        </w:rPr>
-        <w:t xml:space="preserve">Visible to everyone, not just admins, when others are in the voice channel. It only changes what you personally hear — it has no effect on other participants.</w:t>
-      </w:r>
-    </w:p>
-    <w:p>
-      <w:pPr>
-        <w:spacing w:after="200"/>
-      </w:pPr>
-    </w:p>
-    <w:p>
-      <w:pPr>
-        <w:pStyle w:val="Heading1"/>
-        <w:pBdr>
-          <w:bottom w:val="single" w:color="5865F2" w:sz="4" w:space="6"/>
-        </w:pBdr>
-        <w:spacing w:after="160" w:before="360"/>
-      </w:pPr>
-      <w:r>
-        <w:rPr>
-          <w:rFonts w:ascii="Arial" w:cs="Arial" w:eastAsia="Arial" w:hAnsi="Arial"/>
-          <w:b/>
-          <w:bCs/>
-          <w:color w:val="1E1F22"/>
-          <w:sz w:val="28"/>
-          <w:szCs w:val="28"/>
-        </w:rPr>
-        <w:t xml:space="preserve">9. PatchBot — Game Update Tracking</w:t>
-      </w:r>
-    </w:p>
-    <w:p>
-      <w:pPr>
-        <w:spacing w:after="120"/>
-      </w:pPr>
-      <w:r>
-        <w:rPr>
-          <w:rFonts w:ascii="Arial" w:cs="Arial" w:eastAsia="Arial" w:hAnsi="Arial"/>
-          <w:color w:val="313338"/>
-          <w:sz w:val="22"/>
-          <w:szCs w:val="22"/>
-        </w:rPr>
-        <w:t xml:space="preserve">PatchBot watches Steam’s public news feed for games you choose to track and automatically posts new update / patch notes into a channel, as messages from a PatchBot account. It’s the same idea as the Discord PatchBot integration, built natively so it works here too.</w:t>
-      </w:r>
-    </w:p>
-    <w:p>
-      <w:pPr>
-        <w:spacing w:after="80"/>
-      </w:pPr>
-    </w:p>
-    <w:p>
-      <w:pPr>
-        <w:pStyle w:val="Heading2"/>
-        <w:spacing w:after="120" w:before="280"/>
-      </w:pPr>
-      <w:r>
-        <w:rPr>
-          <w:rFonts w:ascii="Arial" w:cs="Arial" w:eastAsia="Arial" w:hAnsi="Arial"/>
-          <w:b/>
-          <w:bCs/>
-          <w:color w:val="5865F2"/>
-          <w:sz w:val="24"/>
-          <w:szCs w:val="24"/>
-        </w:rPr>
-        <w:t xml:space="preserve">9.1 Tracking a Game from a Channel</w:t>
+        <w:t xml:space="preserve">One admin can additionally be marked Owner — a protection layer on top of the admin role, not a separate permission set. An Owner can’t be demoted or removed by another admin, and only the Owner (or, if nobody holds it yet, any admin) can hand the flag to someone else.</w:t>
       </w:r>
     </w:p>
     <w:p>
@@ -5211,7 +5497,7 @@
           <w:sz w:val="22"/>
           <w:szCs w:val="22"/>
         </w:rPr>
-        <w:t xml:space="preserve">Open any text channel and click the controller icon in its header</w:t>
+        <w:t xml:space="preserve">Open the Users tab (Admin Settings or the Admin Portal)</w:t>
       </w:r>
     </w:p>
     <w:p>
@@ -5229,25 +5515,7 @@
           <w:sz w:val="22"/>
           <w:szCs w:val="22"/>
         </w:rPr>
-        <w:t xml:space="preserve">Search for the game by name (matched against Steam’s store search)</w:t>
-      </w:r>
-    </w:p>
-    <w:p>
-      <w:pPr>
-        <w:pStyle w:val="ListParagraph"/>
-        <w:numPr>
-          <w:ilvl w:val="0"/>
-          <w:numId w:val="2"/>
-        </w:numPr>
-        <w:spacing w:after="80"/>
-      </w:pPr>
-      <w:r>
-        <w:rPr>
-          <w:rFonts w:ascii="Arial" w:cs="Arial" w:eastAsia="Arial" w:hAnsi="Arial"/>
-          <w:sz w:val="22"/>
-          <w:szCs w:val="22"/>
-        </w:rPr>
-        <w:t xml:space="preserve">Click Add — it now posts new patch notes into that channel</w:t>
+        <w:t xml:space="preserve">Find the user and click Make Owner (or Transfer Owner, if the flag is already held)</w:t>
       </w:r>
     </w:p>
     <w:p>
@@ -5280,7 +5548,7 @@
               <w:bottom w:val="none" w:color="FFFFFF" w:sz="0"/>
               <w:right w:val="none" w:color="FFFFFF" w:sz="0"/>
             </w:tcBorders>
-            <w:shd w:fill="EEF0FF" w:val="clear"/>
+            <w:shd w:fill="FFF8E1" w:val="clear"/>
             <w:tcMar>
               <w:top w:type="dxa" w:w="120"/>
               <w:left w:type="dxa" w:w="200"/>
@@ -5297,11 +5565,11 @@
                 <w:rFonts w:ascii="Arial" w:cs="Arial" w:eastAsia="Arial" w:hAnsi="Arial"/>
                 <w:b/>
                 <w:bCs/>
-                <w:color w:val="5865F2"/>
+                <w:color w:val="F57C00"/>
                 <w:sz w:val="22"/>
                 <w:szCs w:val="22"/>
               </w:rPr>
-              <w:t xml:space="preserve">NOTE: </w:t>
+              <w:t xml:space="preserve">TIP: </w:t>
             </w:r>
             <w:r>
               <w:rPr>
@@ -5310,7 +5578,7 @@
                 <w:sz w:val="22"/>
                 <w:szCs w:val="22"/>
               </w:rPr>
-              <w:t xml:space="preserve">The first time a game is tracked, PatchBot just records its current latest post as a baseline rather than dumping its whole history into the channel — you’ll see new posts starting with the next real update.</w:t>
+              <w:t xml:space="preserve">There’s no way to remove the Owner flag from within the app once set, other than transferring it to someone else — this is intentional, so ownership can’t be stripped by a compromised admin account.</w:t>
             </w:r>
           </w:p>
         </w:tc>
@@ -5318,7 +5586,46 @@
     </w:tbl>
     <w:p>
       <w:pPr>
-        <w:spacing w:after="160"/>
+        <w:spacing w:after="200"/>
+      </w:pPr>
+    </w:p>
+    <w:p>
+      <w:pPr>
+        <w:pStyle w:val="Heading1"/>
+        <w:pBdr>
+          <w:bottom w:val="single" w:color="5865F2" w:sz="4" w:space="6"/>
+        </w:pBdr>
+        <w:spacing w:after="160" w:before="360"/>
+      </w:pPr>
+      <w:r>
+        <w:rPr>
+          <w:rFonts w:ascii="Arial" w:cs="Arial" w:eastAsia="Arial" w:hAnsi="Arial"/>
+          <w:b/>
+          <w:bCs/>
+          <w:color w:val="1E1F22"/>
+          <w:sz w:val="28"/>
+          <w:szCs w:val="28"/>
+        </w:rPr>
+        <w:t xml:space="preserve">8. Voice Channel Admin Controls</w:t>
+      </w:r>
+    </w:p>
+    <w:p>
+      <w:pPr>
+        <w:spacing w:after="120"/>
+      </w:pPr>
+      <w:r>
+        <w:rPr>
+          <w:rFonts w:ascii="Arial" w:cs="Arial" w:eastAsia="Arial" w:hAnsi="Arial"/>
+          <w:color w:val="313338"/>
+          <w:sz w:val="22"/>
+          <w:szCs w:val="22"/>
+        </w:rPr>
+        <w:t xml:space="preserve">When you join a voice channel as an admin, an In Voice panel appears below the room showing all connected participants.</w:t>
+      </w:r>
+    </w:p>
+    <w:p>
+      <w:pPr>
+        <w:spacing w:after="80"/>
       </w:pPr>
     </w:p>
     <w:p>
@@ -5335,12 +5642,17 @@
           <w:sz w:val="24"/>
           <w:szCs w:val="24"/>
         </w:rPr>
-        <w:t xml:space="preserve">9.2 Managing Games Centrally from the Admin Portal</w:t>
-      </w:r>
-    </w:p>
-    <w:p>
-      <w:pPr>
-        <w:spacing w:after="120"/>
+        <w:t xml:space="preserve">8.1 Muting and Unmuting Participants</w:t>
+      </w:r>
+    </w:p>
+    <w:p>
+      <w:pPr>
+        <w:pStyle w:val="ListParagraph"/>
+        <w:numPr>
+          <w:ilvl w:val="0"/>
+          <w:numId w:val="3"/>
+        </w:numPr>
+        <w:spacing w:after="80"/>
       </w:pPr>
       <w:r>
         <w:rPr>
@@ -5349,7 +5661,45 @@
           <w:sz w:val="22"/>
           <w:szCs w:val="22"/>
         </w:rPr>
-        <w:t xml:space="preserve">Both Admin Settings and the standalone Admin Portal have a Games tab: pick any text channel from the dropdown, then search/add or remove tracked games for it — without needing to open that channel yourself.</w:t>
+        <w:t xml:space="preserve">Each participant shows a microphone icon (green = active, red = muted)</w:t>
+      </w:r>
+    </w:p>
+    <w:p>
+      <w:pPr>
+        <w:pStyle w:val="ListParagraph"/>
+        <w:numPr>
+          <w:ilvl w:val="0"/>
+          <w:numId w:val="3"/>
+        </w:numPr>
+        <w:spacing w:after="80"/>
+      </w:pPr>
+      <w:r>
+        <w:rPr>
+          <w:rFonts w:ascii="Arial" w:cs="Arial" w:eastAsia="Arial" w:hAnsi="Arial"/>
+          <w:color w:val="313338"/>
+          <w:sz w:val="22"/>
+          <w:szCs w:val="22"/>
+        </w:rPr>
+        <w:t xml:space="preserve">Click the mic icon to toggle their server-side mute state — this affects what everyone in the room hears, not just you</w:t>
+      </w:r>
+    </w:p>
+    <w:p>
+      <w:pPr>
+        <w:pStyle w:val="ListParagraph"/>
+        <w:numPr>
+          <w:ilvl w:val="0"/>
+          <w:numId w:val="3"/>
+        </w:numPr>
+        <w:spacing w:after="80"/>
+      </w:pPr>
+      <w:r>
+        <w:rPr>
+          <w:rFonts w:ascii="Arial" w:cs="Arial" w:eastAsia="Arial" w:hAnsi="Arial"/>
+          <w:color w:val="313338"/>
+          <w:sz w:val="22"/>
+          <w:szCs w:val="22"/>
+        </w:rPr>
+        <w:t xml:space="preserve">Click again to unmute them</w:t>
       </w:r>
     </w:p>
     <w:p>
@@ -5371,12 +5721,17 @@
           <w:sz w:val="24"/>
           <w:szCs w:val="24"/>
         </w:rPr>
-        <w:t xml:space="preserve">9.3 Setting the Check Frequency</w:t>
-      </w:r>
-    </w:p>
-    <w:p>
-      <w:pPr>
-        <w:spacing w:after="120"/>
+        <w:t xml:space="preserve">8.2 Removing a Participant from Voice</w:t>
+      </w:r>
+    </w:p>
+    <w:p>
+      <w:pPr>
+        <w:pStyle w:val="ListParagraph"/>
+        <w:numPr>
+          <w:ilvl w:val="0"/>
+          <w:numId w:val="3"/>
+        </w:numPr>
+        <w:spacing w:after="80"/>
       </w:pPr>
       <w:r>
         <w:rPr>
@@ -5385,7 +5740,177 @@
           <w:sz w:val="22"/>
           <w:szCs w:val="22"/>
         </w:rPr>
-        <w:t xml:space="preserve">In the Games tab, the Check Frequency dropdown ranges from every 1 minute to every 24 hours. Saving takes effect on PatchBot’s next scheduled check — no server restart required.</w:t>
+        <w:t xml:space="preserve">Click the remove icon next to a participant and confirm — they are immediately disconnected</w:t>
+      </w:r>
+    </w:p>
+    <w:p>
+      <w:pPr>
+        <w:pStyle w:val="ListParagraph"/>
+        <w:numPr>
+          <w:ilvl w:val="0"/>
+          <w:numId w:val="3"/>
+        </w:numPr>
+        <w:spacing w:after="80"/>
+      </w:pPr>
+      <w:r>
+        <w:rPr>
+          <w:rFonts w:ascii="Arial" w:cs="Arial" w:eastAsia="Arial" w:hAnsi="Arial"/>
+          <w:color w:val="313338"/>
+          <w:sz w:val="22"/>
+          <w:szCs w:val="22"/>
+        </w:rPr>
+        <w:t xml:space="preserve">They can rejoin by clicking Join Voice again</w:t>
+      </w:r>
+    </w:p>
+    <w:p>
+      <w:pPr>
+        <w:spacing w:after="160"/>
+      </w:pPr>
+    </w:p>
+    <w:p>
+      <w:pPr>
+        <w:pStyle w:val="Heading2"/>
+        <w:spacing w:after="120" w:before="280"/>
+      </w:pPr>
+      <w:r>
+        <w:rPr>
+          <w:rFonts w:ascii="Arial" w:cs="Arial" w:eastAsia="Arial" w:hAnsi="Arial"/>
+          <w:b/>
+          <w:bCs/>
+          <w:color w:val="5865F2"/>
+          <w:sz w:val="24"/>
+          <w:szCs w:val="24"/>
+        </w:rPr>
+        <w:t xml:space="preserve">8.3 Volume Mixer (All Users)</w:t>
+      </w:r>
+    </w:p>
+    <w:p>
+      <w:pPr>
+        <w:spacing w:after="120"/>
+      </w:pPr>
+      <w:r>
+        <w:rPr>
+          <w:rFonts w:ascii="Arial" w:cs="Arial" w:eastAsia="Arial" w:hAnsi="Arial"/>
+          <w:color w:val="313338"/>
+          <w:sz w:val="22"/>
+          <w:szCs w:val="22"/>
+        </w:rPr>
+        <w:t xml:space="preserve">Visible to everyone, not just admins, when others are in the voice channel. It only changes what you personally hear — it has no effect on other participants.</w:t>
+      </w:r>
+    </w:p>
+    <w:p>
+      <w:pPr>
+        <w:spacing w:after="200"/>
+      </w:pPr>
+    </w:p>
+    <w:p>
+      <w:pPr>
+        <w:pStyle w:val="Heading1"/>
+        <w:pBdr>
+          <w:bottom w:val="single" w:color="5865F2" w:sz="4" w:space="6"/>
+        </w:pBdr>
+        <w:spacing w:after="160" w:before="360"/>
+      </w:pPr>
+      <w:r>
+        <w:rPr>
+          <w:rFonts w:ascii="Arial" w:cs="Arial" w:eastAsia="Arial" w:hAnsi="Arial"/>
+          <w:b/>
+          <w:bCs/>
+          <w:color w:val="1E1F22"/>
+          <w:sz w:val="28"/>
+          <w:szCs w:val="28"/>
+        </w:rPr>
+        <w:t xml:space="preserve">9. PatchBot — Game Update Tracking</w:t>
+      </w:r>
+    </w:p>
+    <w:p>
+      <w:pPr>
+        <w:spacing w:after="120"/>
+      </w:pPr>
+      <w:r>
+        <w:rPr>
+          <w:rFonts w:ascii="Arial" w:cs="Arial" w:eastAsia="Arial" w:hAnsi="Arial"/>
+          <w:color w:val="313338"/>
+          <w:sz w:val="22"/>
+          <w:szCs w:val="22"/>
+        </w:rPr>
+        <w:t xml:space="preserve">PatchBot watches Steam’s public news feed for games you choose to track and automatically posts new update / patch notes into a channel, as messages from a PatchBot account. It’s the same idea as the Discord PatchBot integration, built natively so it works here too.</w:t>
+      </w:r>
+    </w:p>
+    <w:p>
+      <w:pPr>
+        <w:spacing w:after="80"/>
+      </w:pPr>
+    </w:p>
+    <w:p>
+      <w:pPr>
+        <w:pStyle w:val="Heading2"/>
+        <w:spacing w:after="120" w:before="280"/>
+      </w:pPr>
+      <w:r>
+        <w:rPr>
+          <w:rFonts w:ascii="Arial" w:cs="Arial" w:eastAsia="Arial" w:hAnsi="Arial"/>
+          <w:b/>
+          <w:bCs/>
+          <w:color w:val="5865F2"/>
+          <w:sz w:val="24"/>
+          <w:szCs w:val="24"/>
+        </w:rPr>
+        <w:t xml:space="preserve">9.1 Tracking a Game from a Channel</w:t>
+      </w:r>
+    </w:p>
+    <w:p>
+      <w:pPr>
+        <w:pStyle w:val="ListParagraph"/>
+        <w:numPr>
+          <w:ilvl w:val="0"/>
+          <w:numId w:val="2"/>
+        </w:numPr>
+        <w:spacing w:after="80"/>
+      </w:pPr>
+      <w:r>
+        <w:rPr>
+          <w:rFonts w:ascii="Arial" w:cs="Arial" w:eastAsia="Arial" w:hAnsi="Arial"/>
+          <w:sz w:val="22"/>
+          <w:szCs w:val="22"/>
+        </w:rPr>
+        <w:t xml:space="preserve">Open any text channel and click the controller icon in its header</w:t>
+      </w:r>
+    </w:p>
+    <w:p>
+      <w:pPr>
+        <w:pStyle w:val="ListParagraph"/>
+        <w:numPr>
+          <w:ilvl w:val="0"/>
+          <w:numId w:val="2"/>
+        </w:numPr>
+        <w:spacing w:after="80"/>
+      </w:pPr>
+      <w:r>
+        <w:rPr>
+          <w:rFonts w:ascii="Arial" w:cs="Arial" w:eastAsia="Arial" w:hAnsi="Arial"/>
+          <w:sz w:val="22"/>
+          <w:szCs w:val="22"/>
+        </w:rPr>
+        <w:t xml:space="preserve">Search for the game by name (matched against Steam’s store search)</w:t>
+      </w:r>
+    </w:p>
+    <w:p>
+      <w:pPr>
+        <w:pStyle w:val="ListParagraph"/>
+        <w:numPr>
+          <w:ilvl w:val="0"/>
+          <w:numId w:val="2"/>
+        </w:numPr>
+        <w:spacing w:after="80"/>
+      </w:pPr>
+      <w:r>
+        <w:rPr>
+          <w:rFonts w:ascii="Arial" w:cs="Arial" w:eastAsia="Arial" w:hAnsi="Arial"/>
+          <w:sz w:val="22"/>
+          <w:szCs w:val="22"/>
+        </w:rPr>
+        <w:t xml:space="preserve">Click Add — it now posts new patch notes into that channel</w:t>
       </w:r>
     </w:p>
     <w:p>
@@ -5418,6 +5943,144 @@
               <w:bottom w:val="none" w:color="FFFFFF" w:sz="0"/>
               <w:right w:val="none" w:color="FFFFFF" w:sz="0"/>
             </w:tcBorders>
+            <w:shd w:fill="EEF0FF" w:val="clear"/>
+            <w:tcMar>
+              <w:top w:type="dxa" w:w="120"/>
+              <w:left w:type="dxa" w:w="200"/>
+              <w:bottom w:type="dxa" w:w="120"/>
+              <w:right w:type="dxa" w:w="200"/>
+            </w:tcMar>
+          </w:tcPr>
+          <w:p>
+            <w:pPr>
+              <w:spacing w:after="0"/>
+            </w:pPr>
+            <w:r>
+              <w:rPr>
+                <w:rFonts w:ascii="Arial" w:cs="Arial" w:eastAsia="Arial" w:hAnsi="Arial"/>
+                <w:b/>
+                <w:bCs/>
+                <w:color w:val="5865F2"/>
+                <w:sz w:val="22"/>
+                <w:szCs w:val="22"/>
+              </w:rPr>
+              <w:t xml:space="preserve">NOTE: </w:t>
+            </w:r>
+            <w:r>
+              <w:rPr>
+                <w:rFonts w:ascii="Arial" w:cs="Arial" w:eastAsia="Arial" w:hAnsi="Arial"/>
+                <w:color w:val="313338"/>
+                <w:sz w:val="22"/>
+                <w:szCs w:val="22"/>
+              </w:rPr>
+              <w:t xml:space="preserve">The first time a game is tracked, PatchBot just records its current latest post as a baseline rather than dumping its whole history into the channel — you’ll see new posts starting with the next real update.</w:t>
+            </w:r>
+          </w:p>
+        </w:tc>
+      </w:tr>
+    </w:tbl>
+    <w:p>
+      <w:pPr>
+        <w:spacing w:after="160"/>
+      </w:pPr>
+    </w:p>
+    <w:p>
+      <w:pPr>
+        <w:pStyle w:val="Heading2"/>
+        <w:spacing w:after="120" w:before="280"/>
+      </w:pPr>
+      <w:r>
+        <w:rPr>
+          <w:rFonts w:ascii="Arial" w:cs="Arial" w:eastAsia="Arial" w:hAnsi="Arial"/>
+          <w:b/>
+          <w:bCs/>
+          <w:color w:val="5865F2"/>
+          <w:sz w:val="24"/>
+          <w:szCs w:val="24"/>
+        </w:rPr>
+        <w:t xml:space="preserve">9.2 Managing Games Centrally from the Admin Portal</w:t>
+      </w:r>
+    </w:p>
+    <w:p>
+      <w:pPr>
+        <w:spacing w:after="120"/>
+      </w:pPr>
+      <w:r>
+        <w:rPr>
+          <w:rFonts w:ascii="Arial" w:cs="Arial" w:eastAsia="Arial" w:hAnsi="Arial"/>
+          <w:color w:val="313338"/>
+          <w:sz w:val="22"/>
+          <w:szCs w:val="22"/>
+        </w:rPr>
+        <w:t xml:space="preserve">Both Admin Settings and the standalone Admin Portal have a Games tab: pick any text channel from the dropdown, then search/add or remove tracked games for it — without needing to open that channel yourself.</w:t>
+      </w:r>
+    </w:p>
+    <w:p>
+      <w:pPr>
+        <w:spacing w:after="160"/>
+      </w:pPr>
+    </w:p>
+    <w:p>
+      <w:pPr>
+        <w:pStyle w:val="Heading2"/>
+        <w:spacing w:after="120" w:before="280"/>
+      </w:pPr>
+      <w:r>
+        <w:rPr>
+          <w:rFonts w:ascii="Arial" w:cs="Arial" w:eastAsia="Arial" w:hAnsi="Arial"/>
+          <w:b/>
+          <w:bCs/>
+          <w:color w:val="5865F2"/>
+          <w:sz w:val="24"/>
+          <w:szCs w:val="24"/>
+        </w:rPr>
+        <w:t xml:space="preserve">9.3 Setting the Check Frequency</w:t>
+      </w:r>
+    </w:p>
+    <w:p>
+      <w:pPr>
+        <w:spacing w:after="120"/>
+      </w:pPr>
+      <w:r>
+        <w:rPr>
+          <w:rFonts w:ascii="Arial" w:cs="Arial" w:eastAsia="Arial" w:hAnsi="Arial"/>
+          <w:color w:val="313338"/>
+          <w:sz w:val="22"/>
+          <w:szCs w:val="22"/>
+        </w:rPr>
+        <w:t xml:space="preserve">In the Games tab, the Check Frequency dropdown ranges from every 1 minute to every 24 hours. Saving takes effect on PatchBot’s next scheduled check — no server restart required.</w:t>
+      </w:r>
+    </w:p>
+    <w:p>
+      <w:pPr>
+        <w:spacing w:after="80"/>
+      </w:pPr>
+    </w:p>
+    <w:tbl>
+      <w:tblPr>
+        <w:tblW w:type="dxa" w:w="9360"/>
+        <w:tblBorders>
+          <w:top w:val="single" w:color="auto" w:sz="4"/>
+          <w:left w:val="single" w:color="auto" w:sz="4"/>
+          <w:bottom w:val="single" w:color="auto" w:sz="4"/>
+          <w:right w:val="single" w:color="auto" w:sz="4"/>
+          <w:insideH w:val="single" w:color="auto" w:sz="4"/>
+          <w:insideV w:val="single" w:color="auto" w:sz="4"/>
+        </w:tblBorders>
+      </w:tblPr>
+      <w:tblGrid>
+        <w:gridCol w:w="9360"/>
+      </w:tblGrid>
+      <w:tr>
+        <w:tc>
+          <w:tcPr>
+            <w:tcW w:type="dxa" w:w="9360"/>
+            <w:tcBorders>
+              <w:top w:val="none" w:color="FFFFFF" w:sz="0"/>
+              <w:left w:val="none" w:color="FFFFFF" w:sz="0"/>
+              <w:bottom w:val="none" w:color="FFFFFF" w:sz="0"/>
+              <w:right w:val="none" w:color="FFFFFF" w:sz="0"/>
+            </w:tcBorders>
             <w:shd w:fill="FFF8E1" w:val="clear"/>
             <w:tcMar>
               <w:top w:type="dxa" w:w="120"/>
@@ -5568,7 +6231,573 @@
           <w:sz w:val="28"/>
           <w:szCs w:val="28"/>
         </w:rPr>
-        <w:t xml:space="preserve">11. Quick Reference</w:t>
+        <w:t xml:space="preserve">11. Custom Emoji</w:t>
+      </w:r>
+    </w:p>
+    <w:p>
+      <w:pPr>
+        <w:spacing w:after="120"/>
+      </w:pPr>
+      <w:r>
+        <w:rPr>
+          <w:rFonts w:ascii="Arial" w:cs="Arial" w:eastAsia="Arial" w:hAnsi="Arial"/>
+          <w:color w:val="313338"/>
+          <w:sz w:val="22"/>
+          <w:szCs w:val="22"/>
+        </w:rPr>
+        <w:t xml:space="preserve">The Custom Emoji tab (Admin Settings or the Admin Portal) lets you upload server-specific emoji that anyone can use by typing :name: in a message or picking them as a reaction.</w:t>
+      </w:r>
+    </w:p>
+    <w:p>
+      <w:pPr>
+        <w:pStyle w:val="ListParagraph"/>
+        <w:numPr>
+          <w:ilvl w:val="0"/>
+          <w:numId w:val="2"/>
+        </w:numPr>
+        <w:spacing w:after="80"/>
+      </w:pPr>
+      <w:r>
+        <w:rPr>
+          <w:rFonts w:ascii="Arial" w:cs="Arial" w:eastAsia="Arial" w:hAnsi="Arial"/>
+          <w:sz w:val="22"/>
+          <w:szCs w:val="22"/>
+        </w:rPr>
+        <w:t xml:space="preserve">Open the Custom Emoji tab</w:t>
+      </w:r>
+    </w:p>
+    <w:p>
+      <w:pPr>
+        <w:pStyle w:val="ListParagraph"/>
+        <w:numPr>
+          <w:ilvl w:val="0"/>
+          <w:numId w:val="2"/>
+        </w:numPr>
+        <w:spacing w:after="80"/>
+      </w:pPr>
+      <w:r>
+        <w:rPr>
+          <w:rFonts w:ascii="Arial" w:cs="Arial" w:eastAsia="Arial" w:hAnsi="Arial"/>
+          <w:sz w:val="22"/>
+          <w:szCs w:val="22"/>
+        </w:rPr>
+        <w:t xml:space="preserve">Click Upload, choose an image, and give it a name (letters, numbers, and underscores)</w:t>
+      </w:r>
+    </w:p>
+    <w:p>
+      <w:pPr>
+        <w:pStyle w:val="ListParagraph"/>
+        <w:numPr>
+          <w:ilvl w:val="0"/>
+          <w:numId w:val="2"/>
+        </w:numPr>
+        <w:spacing w:after="80"/>
+      </w:pPr>
+      <w:r>
+        <w:rPr>
+          <w:rFonts w:ascii="Arial" w:cs="Arial" w:eastAsia="Arial" w:hAnsi="Arial"/>
+          <w:sz w:val="22"/>
+          <w:szCs w:val="22"/>
+        </w:rPr>
+        <w:t xml:space="preserve">Click a delete icon next to any existing emoji to remove it — it disappears from new messages immediately, but stays visible in messages already sent</w:t>
+      </w:r>
+    </w:p>
+    <w:p>
+      <w:pPr>
+        <w:spacing w:after="80"/>
+      </w:pPr>
+    </w:p>
+    <w:tbl>
+      <w:tblPr>
+        <w:tblW w:type="dxa" w:w="9360"/>
+        <w:tblBorders>
+          <w:top w:val="single" w:color="auto" w:sz="4"/>
+          <w:left w:val="single" w:color="auto" w:sz="4"/>
+          <w:bottom w:val="single" w:color="auto" w:sz="4"/>
+          <w:right w:val="single" w:color="auto" w:sz="4"/>
+          <w:insideH w:val="single" w:color="auto" w:sz="4"/>
+          <w:insideV w:val="single" w:color="auto" w:sz="4"/>
+        </w:tblBorders>
+      </w:tblPr>
+      <w:tblGrid>
+        <w:gridCol w:w="9360"/>
+      </w:tblGrid>
+      <w:tr>
+        <w:tc>
+          <w:tcPr>
+            <w:tcW w:type="dxa" w:w="9360"/>
+            <w:tcBorders>
+              <w:top w:val="none" w:color="FFFFFF" w:sz="0"/>
+              <w:left w:val="none" w:color="FFFFFF" w:sz="0"/>
+              <w:bottom w:val="none" w:color="FFFFFF" w:sz="0"/>
+              <w:right w:val="none" w:color="FFFFFF" w:sz="0"/>
+            </w:tcBorders>
+            <w:shd w:fill="EEF0FF" w:val="clear"/>
+            <w:tcMar>
+              <w:top w:type="dxa" w:w="120"/>
+              <w:left w:type="dxa" w:w="200"/>
+              <w:bottom w:type="dxa" w:w="120"/>
+              <w:right w:type="dxa" w:w="200"/>
+            </w:tcMar>
+          </w:tcPr>
+          <w:p>
+            <w:pPr>
+              <w:spacing w:after="0"/>
+            </w:pPr>
+            <w:r>
+              <w:rPr>
+                <w:rFonts w:ascii="Arial" w:cs="Arial" w:eastAsia="Arial" w:hAnsi="Arial"/>
+                <w:b/>
+                <w:bCs/>
+                <w:color w:val="5865F2"/>
+                <w:sz w:val="22"/>
+                <w:szCs w:val="22"/>
+              </w:rPr>
+              <w:t xml:space="preserve">NOTE: </w:t>
+            </w:r>
+            <w:r>
+              <w:rPr>
+                <w:rFonts w:ascii="Arial" w:cs="Arial" w:eastAsia="Arial" w:hAnsi="Arial"/>
+                <w:color w:val="313338"/>
+                <w:sz w:val="22"/>
+                <w:szCs w:val="22"/>
+              </w:rPr>
+              <w:t xml:space="preserve">Limits: 200 emoji per server, up to about 512KB each.</w:t>
+            </w:r>
+          </w:p>
+        </w:tc>
+      </w:tr>
+    </w:tbl>
+    <w:p>
+      <w:pPr>
+        <w:spacing w:after="200"/>
+      </w:pPr>
+    </w:p>
+    <w:p>
+      <w:pPr>
+        <w:pStyle w:val="Heading1"/>
+        <w:pBdr>
+          <w:bottom w:val="single" w:color="5865F2" w:sz="4" w:space="6"/>
+        </w:pBdr>
+        <w:spacing w:after="160" w:before="360"/>
+      </w:pPr>
+      <w:r>
+        <w:rPr>
+          <w:rFonts w:ascii="Arial" w:cs="Arial" w:eastAsia="Arial" w:hAnsi="Arial"/>
+          <w:b/>
+          <w:bCs/>
+          <w:color w:val="1E1F22"/>
+          <w:sz w:val="28"/>
+          <w:szCs w:val="28"/>
+        </w:rPr>
+        <w:t xml:space="preserve">12. Soundboard</w:t>
+      </w:r>
+    </w:p>
+    <w:p>
+      <w:pPr>
+        <w:spacing w:after="120"/>
+      </w:pPr>
+      <w:r>
+        <w:rPr>
+          <w:rFonts w:ascii="Arial" w:cs="Arial" w:eastAsia="Arial" w:hAnsi="Arial"/>
+          <w:color w:val="313338"/>
+          <w:sz w:val="22"/>
+          <w:szCs w:val="22"/>
+        </w:rPr>
+        <w:t xml:space="preserve">The Soundboard tab lets you upload audio clips that appear in the Soundboard panel inside every voice channel, for anyone to play during a call.</w:t>
+      </w:r>
+    </w:p>
+    <w:p>
+      <w:pPr>
+        <w:pStyle w:val="ListParagraph"/>
+        <w:numPr>
+          <w:ilvl w:val="0"/>
+          <w:numId w:val="2"/>
+        </w:numPr>
+        <w:spacing w:after="80"/>
+      </w:pPr>
+      <w:r>
+        <w:rPr>
+          <w:rFonts w:ascii="Arial" w:cs="Arial" w:eastAsia="Arial" w:hAnsi="Arial"/>
+          <w:sz w:val="22"/>
+          <w:szCs w:val="22"/>
+        </w:rPr>
+        <w:t xml:space="preserve">Open the Soundboard tab</w:t>
+      </w:r>
+    </w:p>
+    <w:p>
+      <w:pPr>
+        <w:pStyle w:val="ListParagraph"/>
+        <w:numPr>
+          <w:ilvl w:val="0"/>
+          <w:numId w:val="2"/>
+        </w:numPr>
+        <w:spacing w:after="80"/>
+      </w:pPr>
+      <w:r>
+        <w:rPr>
+          <w:rFonts w:ascii="Arial" w:cs="Arial" w:eastAsia="Arial" w:hAnsi="Arial"/>
+          <w:sz w:val="22"/>
+          <w:szCs w:val="22"/>
+        </w:rPr>
+        <w:t xml:space="preserve">Click Upload, choose an audio file, and give it a name</w:t>
+      </w:r>
+    </w:p>
+    <w:p>
+      <w:pPr>
+        <w:pStyle w:val="ListParagraph"/>
+        <w:numPr>
+          <w:ilvl w:val="0"/>
+          <w:numId w:val="2"/>
+        </w:numPr>
+        <w:spacing w:after="80"/>
+      </w:pPr>
+      <w:r>
+        <w:rPr>
+          <w:rFonts w:ascii="Arial" w:cs="Arial" w:eastAsia="Arial" w:hAnsi="Arial"/>
+          <w:sz w:val="22"/>
+          <w:szCs w:val="22"/>
+        </w:rPr>
+        <w:t xml:space="preserve">Click a delete icon next to any existing clip to remove it from the soundboard</w:t>
+      </w:r>
+    </w:p>
+    <w:p>
+      <w:pPr>
+        <w:spacing w:after="80"/>
+      </w:pPr>
+    </w:p>
+    <w:tbl>
+      <w:tblPr>
+        <w:tblW w:type="dxa" w:w="9360"/>
+        <w:tblBorders>
+          <w:top w:val="single" w:color="auto" w:sz="4"/>
+          <w:left w:val="single" w:color="auto" w:sz="4"/>
+          <w:bottom w:val="single" w:color="auto" w:sz="4"/>
+          <w:right w:val="single" w:color="auto" w:sz="4"/>
+          <w:insideH w:val="single" w:color="auto" w:sz="4"/>
+          <w:insideV w:val="single" w:color="auto" w:sz="4"/>
+        </w:tblBorders>
+      </w:tblPr>
+      <w:tblGrid>
+        <w:gridCol w:w="9360"/>
+      </w:tblGrid>
+      <w:tr>
+        <w:tc>
+          <w:tcPr>
+            <w:tcW w:type="dxa" w:w="9360"/>
+            <w:tcBorders>
+              <w:top w:val="none" w:color="FFFFFF" w:sz="0"/>
+              <w:left w:val="none" w:color="FFFFFF" w:sz="0"/>
+              <w:bottom w:val="none" w:color="FFFFFF" w:sz="0"/>
+              <w:right w:val="none" w:color="FFFFFF" w:sz="0"/>
+            </w:tcBorders>
+            <w:shd w:fill="EEF0FF" w:val="clear"/>
+            <w:tcMar>
+              <w:top w:type="dxa" w:w="120"/>
+              <w:left w:type="dxa" w:w="200"/>
+              <w:bottom w:type="dxa" w:w="120"/>
+              <w:right w:type="dxa" w:w="200"/>
+            </w:tcMar>
+          </w:tcPr>
+          <w:p>
+            <w:pPr>
+              <w:spacing w:after="0"/>
+            </w:pPr>
+            <w:r>
+              <w:rPr>
+                <w:rFonts w:ascii="Arial" w:cs="Arial" w:eastAsia="Arial" w:hAnsi="Arial"/>
+                <w:b/>
+                <w:bCs/>
+                <w:color w:val="5865F2"/>
+                <w:sz w:val="22"/>
+                <w:szCs w:val="22"/>
+              </w:rPr>
+              <w:t xml:space="preserve">NOTE: </w:t>
+            </w:r>
+            <w:r>
+              <w:rPr>
+                <w:rFonts w:ascii="Arial" w:cs="Arial" w:eastAsia="Arial" w:hAnsi="Arial"/>
+                <w:color w:val="313338"/>
+                <w:sz w:val="22"/>
+                <w:szCs w:val="22"/>
+              </w:rPr>
+              <w:t xml:space="preserve">Limits: 500 clips per server, up to about 5MB each. Each user’s own playback volume for a clip is personal to them and doesn’t affect what it sounds like for anyone else.</w:t>
+            </w:r>
+          </w:p>
+        </w:tc>
+      </w:tr>
+    </w:tbl>
+    <w:p>
+      <w:pPr>
+        <w:spacing w:after="200"/>
+      </w:pPr>
+    </w:p>
+    <w:p>
+      <w:pPr>
+        <w:pStyle w:val="Heading1"/>
+        <w:pBdr>
+          <w:bottom w:val="single" w:color="5865F2" w:sz="4" w:space="6"/>
+        </w:pBdr>
+        <w:spacing w:after="160" w:before="360"/>
+      </w:pPr>
+      <w:r>
+        <w:rPr>
+          <w:rFonts w:ascii="Arial" w:cs="Arial" w:eastAsia="Arial" w:hAnsi="Arial"/>
+          <w:b/>
+          <w:bCs/>
+          <w:color w:val="1E1F22"/>
+          <w:sz w:val="28"/>
+          <w:szCs w:val="28"/>
+        </w:rPr>
+        <w:t xml:space="preserve">13. Releasing a Desktop App Update</w:t>
+      </w:r>
+    </w:p>
+    <w:p>
+      <w:pPr>
+        <w:spacing w:after="120"/>
+      </w:pPr>
+      <w:r>
+        <w:rPr>
+          <w:rFonts w:ascii="Arial" w:cs="Arial" w:eastAsia="Arial" w:hAnsi="Arial"/>
+          <w:color w:val="313338"/>
+          <w:sz w:val="22"/>
+          <w:szCs w:val="22"/>
+        </w:rPr>
+        <w:t xml:space="preserve">The desktop app (Windows/macOS/Linux) checks GitHub Releases for new versions and updates itself automatically — this is separate from the web deploy on Railway, which updates the moment you push to the repo.</w:t>
+      </w:r>
+    </w:p>
+    <w:p>
+      <w:pPr>
+        <w:spacing w:after="80"/>
+      </w:pPr>
+    </w:p>
+    <w:p>
+      <w:pPr>
+        <w:pStyle w:val="ListParagraph"/>
+        <w:numPr>
+          <w:ilvl w:val="0"/>
+          <w:numId w:val="2"/>
+        </w:numPr>
+        <w:spacing w:after="80"/>
+      </w:pPr>
+      <w:r>
+        <w:rPr>
+          <w:rFonts w:ascii="Arial" w:cs="Arial" w:eastAsia="Arial" w:hAnsi="Arial"/>
+          <w:sz w:val="22"/>
+          <w:szCs w:val="22"/>
+        </w:rPr>
+        <w:t xml:space="preserve">In desktop/package.json, bump the "version" field (e.g. 2.0.0 → 2.1.0)</w:t>
+      </w:r>
+    </w:p>
+    <w:p>
+      <w:pPr>
+        <w:pStyle w:val="ListParagraph"/>
+        <w:numPr>
+          <w:ilvl w:val="0"/>
+          <w:numId w:val="2"/>
+        </w:numPr>
+        <w:spacing w:after="80"/>
+      </w:pPr>
+      <w:r>
+        <w:rPr>
+          <w:rFonts w:ascii="Arial" w:cs="Arial" w:eastAsia="Arial" w:hAnsi="Arial"/>
+          <w:sz w:val="22"/>
+          <w:szCs w:val="22"/>
+        </w:rPr>
+        <w:t xml:space="preserve">Create a GitHub personal access token with repo scope, at github.com/settings/tokens/new, if you don’t already have one handy</w:t>
+      </w:r>
+    </w:p>
+    <w:p>
+      <w:pPr>
+        <w:pStyle w:val="ListParagraph"/>
+        <w:numPr>
+          <w:ilvl w:val="0"/>
+          <w:numId w:val="2"/>
+        </w:numPr>
+        <w:spacing w:after="80"/>
+      </w:pPr>
+      <w:r>
+        <w:rPr>
+          <w:rFonts w:ascii="Arial" w:cs="Arial" w:eastAsia="Arial" w:hAnsi="Arial"/>
+          <w:sz w:val="22"/>
+          <w:szCs w:val="22"/>
+        </w:rPr>
+        <w:t xml:space="preserve">From the desktop/ folder, run the matching release script with that token set for the command — e.g. on Windows: GH_TOKEN=your_token npm run release:win</w:t>
+      </w:r>
+    </w:p>
+    <w:p>
+      <w:pPr>
+        <w:pStyle w:val="ListParagraph"/>
+        <w:numPr>
+          <w:ilvl w:val="0"/>
+          <w:numId w:val="2"/>
+        </w:numPr>
+        <w:spacing w:after="80"/>
+      </w:pPr>
+      <w:r>
+        <w:rPr>
+          <w:rFonts w:ascii="Arial" w:cs="Arial" w:eastAsia="Arial" w:hAnsi="Arial"/>
+          <w:sz w:val="22"/>
+          <w:szCs w:val="22"/>
+        </w:rPr>
+        <w:t xml:space="preserve">electron-builder builds the installer and publishes it as a new GitHub Release automatically — existing installs pick it up on their next launch</w:t>
+      </w:r>
+    </w:p>
+    <w:p>
+      <w:pPr>
+        <w:spacing w:after="80"/>
+      </w:pPr>
+    </w:p>
+    <w:tbl>
+      <w:tblPr>
+        <w:tblW w:type="dxa" w:w="9360"/>
+        <w:tblBorders>
+          <w:top w:val="single" w:color="auto" w:sz="4"/>
+          <w:left w:val="single" w:color="auto" w:sz="4"/>
+          <w:bottom w:val="single" w:color="auto" w:sz="4"/>
+          <w:right w:val="single" w:color="auto" w:sz="4"/>
+          <w:insideH w:val="single" w:color="auto" w:sz="4"/>
+          <w:insideV w:val="single" w:color="auto" w:sz="4"/>
+        </w:tblBorders>
+      </w:tblPr>
+      <w:tblGrid>
+        <w:gridCol w:w="9360"/>
+      </w:tblGrid>
+      <w:tr>
+        <w:tc>
+          <w:tcPr>
+            <w:tcW w:type="dxa" w:w="9360"/>
+            <w:tcBorders>
+              <w:top w:val="none" w:color="FFFFFF" w:sz="0"/>
+              <w:left w:val="none" w:color="FFFFFF" w:sz="0"/>
+              <w:bottom w:val="none" w:color="FFFFFF" w:sz="0"/>
+              <w:right w:val="none" w:color="FFFFFF" w:sz="0"/>
+            </w:tcBorders>
+            <w:shd w:fill="EEF0FF" w:val="clear"/>
+            <w:tcMar>
+              <w:top w:type="dxa" w:w="120"/>
+              <w:left w:type="dxa" w:w="200"/>
+              <w:bottom w:type="dxa" w:w="120"/>
+              <w:right w:type="dxa" w:w="200"/>
+            </w:tcMar>
+          </w:tcPr>
+          <w:p>
+            <w:pPr>
+              <w:spacing w:after="0"/>
+            </w:pPr>
+            <w:r>
+              <w:rPr>
+                <w:rFonts w:ascii="Arial" w:cs="Arial" w:eastAsia="Arial" w:hAnsi="Arial"/>
+                <w:b/>
+                <w:bCs/>
+                <w:color w:val="5865F2"/>
+                <w:sz w:val="22"/>
+                <w:szCs w:val="22"/>
+              </w:rPr>
+              <w:t xml:space="preserve">NOTE: </w:t>
+            </w:r>
+            <w:r>
+              <w:rPr>
+                <w:rFonts w:ascii="Arial" w:cs="Arial" w:eastAsia="Arial" w:hAnsi="Arial"/>
+                <w:color w:val="313338"/>
+                <w:sz w:val="22"/>
+                <w:szCs w:val="22"/>
+              </w:rPr>
+              <w:t xml:space="preserve">Revoke the token from GitHub once you’re done publishing — it doesn’t need to stay active between releases.</w:t>
+            </w:r>
+          </w:p>
+        </w:tc>
+      </w:tr>
+    </w:tbl>
+    <w:p>
+      <w:pPr>
+        <w:spacing w:after="80"/>
+      </w:pPr>
+    </w:p>
+    <w:tbl>
+      <w:tblPr>
+        <w:tblW w:type="dxa" w:w="9360"/>
+        <w:tblBorders>
+          <w:top w:val="single" w:color="auto" w:sz="4"/>
+          <w:left w:val="single" w:color="auto" w:sz="4"/>
+          <w:bottom w:val="single" w:color="auto" w:sz="4"/>
+          <w:right w:val="single" w:color="auto" w:sz="4"/>
+          <w:insideH w:val="single" w:color="auto" w:sz="4"/>
+          <w:insideV w:val="single" w:color="auto" w:sz="4"/>
+        </w:tblBorders>
+      </w:tblPr>
+      <w:tblGrid>
+        <w:gridCol w:w="9360"/>
+      </w:tblGrid>
+      <w:tr>
+        <w:tc>
+          <w:tcPr>
+            <w:tcW w:type="dxa" w:w="9360"/>
+            <w:tcBorders>
+              <w:top w:val="none" w:color="FFFFFF" w:sz="0"/>
+              <w:left w:val="none" w:color="FFFFFF" w:sz="0"/>
+              <w:bottom w:val="none" w:color="FFFFFF" w:sz="0"/>
+              <w:right w:val="none" w:color="FFFFFF" w:sz="0"/>
+            </w:tcBorders>
+            <w:shd w:fill="FFF8E1" w:val="clear"/>
+            <w:tcMar>
+              <w:top w:type="dxa" w:w="120"/>
+              <w:left w:type="dxa" w:w="200"/>
+              <w:bottom w:type="dxa" w:w="120"/>
+              <w:right w:type="dxa" w:w="200"/>
+            </w:tcMar>
+          </w:tcPr>
+          <w:p>
+            <w:pPr>
+              <w:spacing w:after="0"/>
+            </w:pPr>
+            <w:r>
+              <w:rPr>
+                <w:rFonts w:ascii="Arial" w:cs="Arial" w:eastAsia="Arial" w:hAnsi="Arial"/>
+                <w:b/>
+                <w:bCs/>
+                <w:color w:val="F57C00"/>
+                <w:sz w:val="22"/>
+                <w:szCs w:val="22"/>
+              </w:rPr>
+              <w:t xml:space="preserve">TIP: </w:t>
+            </w:r>
+            <w:r>
+              <w:rPr>
+                <w:rFonts w:ascii="Arial" w:cs="Arial" w:eastAsia="Arial" w:hAnsi="Arial"/>
+                <w:color w:val="313338"/>
+                <w:sz w:val="22"/>
+                <w:szCs w:val="22"/>
+              </w:rPr>
+              <w:t xml:space="preserve">A Linux (.AppImage) build can only be produced on a Linux machine, or on Windows/Mac with WSL or Docker installed — electron-builder shells out to a Linux tool (mksquashfs) that plain Windows can’t execute. A macOS build additionally needs Apple notarization, which isn’t set up for this project — Mac users should use the browser or the installable web app in the meantime.</w:t>
+            </w:r>
+          </w:p>
+        </w:tc>
+      </w:tr>
+    </w:tbl>
+    <w:p>
+      <w:pPr>
+        <w:spacing w:after="200"/>
+      </w:pPr>
+    </w:p>
+    <w:p>
+      <w:pPr>
+        <w:pStyle w:val="Heading1"/>
+        <w:pBdr>
+          <w:bottom w:val="single" w:color="5865F2" w:sz="4" w:space="6"/>
+        </w:pBdr>
+        <w:spacing w:after="160" w:before="360"/>
+      </w:pPr>
+      <w:r>
+        <w:rPr>
+          <w:rFonts w:ascii="Arial" w:cs="Arial" w:eastAsia="Arial" w:hAnsi="Arial"/>
+          <w:b/>
+          <w:bCs/>
+          <w:color w:val="1E1F22"/>
+          <w:sz w:val="28"/>
+          <w:szCs w:val="28"/>
+        </w:rPr>
+        <w:t xml:space="preserve">14. Quick Reference</w:t>
       </w:r>
     </w:p>
     <w:tbl>
@@ -6588,7 +7817,7 @@
                 <w:sz w:val="20"/>
                 <w:szCs w:val="20"/>
               </w:rPr>
-              <w:t xml:space="preserve">View server logs</w:t>
+              <w:t xml:space="preserve">Upload / delete custom emoji</w:t>
             </w:r>
           </w:p>
         </w:tc>
@@ -6617,7 +7846,7 @@
                 <w:sz w:val="20"/>
                 <w:szCs w:val="20"/>
               </w:rPr>
-              <w:t xml:space="preserve">Railway &gt; backend service &gt; Deployments &gt; View logs</w:t>
+              <w:t xml:space="preserve">Admin Settings or Admin Portal &gt; Custom Emoji</w:t>
             </w:r>
           </w:p>
         </w:tc>
@@ -6648,6 +7877,306 @@
                 <w:sz w:val="20"/>
                 <w:szCs w:val="20"/>
               </w:rPr>
+              <w:t xml:space="preserve">Upload / delete a soundboard clip</w:t>
+            </w:r>
+          </w:p>
+        </w:tc>
+        <w:tc>
+          <w:tcPr>
+            <w:tcW w:type="dxa" w:w="5560"/>
+            <w:tcBorders>
+              <w:top w:val="single" w:color="DDDDDD" w:sz="1"/>
+              <w:left w:val="single" w:color="DDDDDD" w:sz="1"/>
+              <w:bottom w:val="single" w:color="DDDDDD" w:sz="1"/>
+              <w:right w:val="single" w:color="DDDDDD" w:sz="1"/>
+            </w:tcBorders>
+            <w:shd w:fill="FFFFFF" w:val="clear"/>
+            <w:tcMar>
+              <w:top w:type="dxa" w:w="80"/>
+              <w:left w:type="dxa" w:w="150"/>
+              <w:bottom w:type="dxa" w:w="80"/>
+              <w:right w:type="dxa" w:w="150"/>
+            </w:tcMar>
+          </w:tcPr>
+          <w:p>
+            <w:r>
+              <w:rPr>
+                <w:rFonts w:ascii="Arial" w:cs="Arial" w:eastAsia="Arial" w:hAnsi="Arial"/>
+                <w:color w:val="313338"/>
+                <w:sz w:val="20"/>
+                <w:szCs w:val="20"/>
+              </w:rPr>
+              <w:t xml:space="preserve">Admin Settings or Admin Portal &gt; Soundboard</w:t>
+            </w:r>
+          </w:p>
+        </w:tc>
+      </w:tr>
+      <w:tr>
+        <w:tc>
+          <w:tcPr>
+            <w:tcW w:type="dxa" w:w="3800"/>
+            <w:tcBorders>
+              <w:top w:val="single" w:color="DDDDDD" w:sz="1"/>
+              <w:left w:val="single" w:color="DDDDDD" w:sz="1"/>
+              <w:bottom w:val="single" w:color="DDDDDD" w:sz="1"/>
+              <w:right w:val="single" w:color="DDDDDD" w:sz="1"/>
+            </w:tcBorders>
+            <w:shd w:fill="F8F9FF" w:val="clear"/>
+            <w:tcMar>
+              <w:top w:type="dxa" w:w="80"/>
+              <w:left w:type="dxa" w:w="150"/>
+              <w:bottom w:type="dxa" w:w="80"/>
+              <w:right w:type="dxa" w:w="150"/>
+            </w:tcMar>
+          </w:tcPr>
+          <w:p>
+            <w:r>
+              <w:rPr>
+                <w:rFonts w:ascii="Arial" w:cs="Arial" w:eastAsia="Arial" w:hAnsi="Arial"/>
+                <w:color w:val="313338"/>
+                <w:sz w:val="20"/>
+                <w:szCs w:val="20"/>
+              </w:rPr>
+              <w:t xml:space="preserve">Change server icon / category labels</w:t>
+            </w:r>
+          </w:p>
+        </w:tc>
+        <w:tc>
+          <w:tcPr>
+            <w:tcW w:type="dxa" w:w="5560"/>
+            <w:tcBorders>
+              <w:top w:val="single" w:color="DDDDDD" w:sz="1"/>
+              <w:left w:val="single" w:color="DDDDDD" w:sz="1"/>
+              <w:bottom w:val="single" w:color="DDDDDD" w:sz="1"/>
+              <w:right w:val="single" w:color="DDDDDD" w:sz="1"/>
+            </w:tcBorders>
+            <w:shd w:fill="F8F9FF" w:val="clear"/>
+            <w:tcMar>
+              <w:top w:type="dxa" w:w="80"/>
+              <w:left w:type="dxa" w:w="150"/>
+              <w:bottom w:type="dxa" w:w="80"/>
+              <w:right w:type="dxa" w:w="150"/>
+            </w:tcMar>
+          </w:tcPr>
+          <w:p>
+            <w:r>
+              <w:rPr>
+                <w:rFonts w:ascii="Arial" w:cs="Arial" w:eastAsia="Arial" w:hAnsi="Arial"/>
+                <w:color w:val="313338"/>
+                <w:sz w:val="20"/>
+                <w:szCs w:val="20"/>
+              </w:rPr>
+              <w:t xml:space="preserve">Admin Settings or Admin Portal &gt; Server tab</w:t>
+            </w:r>
+          </w:p>
+        </w:tc>
+      </w:tr>
+      <w:tr>
+        <w:tc>
+          <w:tcPr>
+            <w:tcW w:type="dxa" w:w="3800"/>
+            <w:tcBorders>
+              <w:top w:val="single" w:color="DDDDDD" w:sz="1"/>
+              <w:left w:val="single" w:color="DDDDDD" w:sz="1"/>
+              <w:bottom w:val="single" w:color="DDDDDD" w:sz="1"/>
+              <w:right w:val="single" w:color="DDDDDD" w:sz="1"/>
+            </w:tcBorders>
+            <w:shd w:fill="FFFFFF" w:val="clear"/>
+            <w:tcMar>
+              <w:top w:type="dxa" w:w="80"/>
+              <w:left w:type="dxa" w:w="150"/>
+              <w:bottom w:type="dxa" w:w="80"/>
+              <w:right w:type="dxa" w:w="150"/>
+            </w:tcMar>
+          </w:tcPr>
+          <w:p>
+            <w:r>
+              <w:rPr>
+                <w:rFonts w:ascii="Arial" w:cs="Arial" w:eastAsia="Arial" w:hAnsi="Arial"/>
+                <w:color w:val="313338"/>
+                <w:sz w:val="20"/>
+                <w:szCs w:val="20"/>
+              </w:rPr>
+              <w:t xml:space="preserve">Make/transfer server Owner</w:t>
+            </w:r>
+          </w:p>
+        </w:tc>
+        <w:tc>
+          <w:tcPr>
+            <w:tcW w:type="dxa" w:w="5560"/>
+            <w:tcBorders>
+              <w:top w:val="single" w:color="DDDDDD" w:sz="1"/>
+              <w:left w:val="single" w:color="DDDDDD" w:sz="1"/>
+              <w:bottom w:val="single" w:color="DDDDDD" w:sz="1"/>
+              <w:right w:val="single" w:color="DDDDDD" w:sz="1"/>
+            </w:tcBorders>
+            <w:shd w:fill="FFFFFF" w:val="clear"/>
+            <w:tcMar>
+              <w:top w:type="dxa" w:w="80"/>
+              <w:left w:type="dxa" w:w="150"/>
+              <w:bottom w:type="dxa" w:w="80"/>
+              <w:right w:type="dxa" w:w="150"/>
+            </w:tcMar>
+          </w:tcPr>
+          <w:p>
+            <w:r>
+              <w:rPr>
+                <w:rFonts w:ascii="Arial" w:cs="Arial" w:eastAsia="Arial" w:hAnsi="Arial"/>
+                <w:color w:val="313338"/>
+                <w:sz w:val="20"/>
+                <w:szCs w:val="20"/>
+              </w:rPr>
+              <w:t xml:space="preserve">Admin Settings or Admin Portal &gt; Users &gt; Make/Transfer Owner</w:t>
+            </w:r>
+          </w:p>
+        </w:tc>
+      </w:tr>
+      <w:tr>
+        <w:tc>
+          <w:tcPr>
+            <w:tcW w:type="dxa" w:w="3800"/>
+            <w:tcBorders>
+              <w:top w:val="single" w:color="DDDDDD" w:sz="1"/>
+              <w:left w:val="single" w:color="DDDDDD" w:sz="1"/>
+              <w:bottom w:val="single" w:color="DDDDDD" w:sz="1"/>
+              <w:right w:val="single" w:color="DDDDDD" w:sz="1"/>
+            </w:tcBorders>
+            <w:shd w:fill="F8F9FF" w:val="clear"/>
+            <w:tcMar>
+              <w:top w:type="dxa" w:w="80"/>
+              <w:left w:type="dxa" w:w="150"/>
+              <w:bottom w:type="dxa" w:w="80"/>
+              <w:right w:type="dxa" w:w="150"/>
+            </w:tcMar>
+          </w:tcPr>
+          <w:p>
+            <w:r>
+              <w:rPr>
+                <w:rFonts w:ascii="Arial" w:cs="Arial" w:eastAsia="Arial" w:hAnsi="Arial"/>
+                <w:color w:val="313338"/>
+                <w:sz w:val="20"/>
+                <w:szCs w:val="20"/>
+              </w:rPr>
+              <w:t xml:space="preserve">Release a desktop app update</w:t>
+            </w:r>
+          </w:p>
+        </w:tc>
+        <w:tc>
+          <w:tcPr>
+            <w:tcW w:type="dxa" w:w="5560"/>
+            <w:tcBorders>
+              <w:top w:val="single" w:color="DDDDDD" w:sz="1"/>
+              <w:left w:val="single" w:color="DDDDDD" w:sz="1"/>
+              <w:bottom w:val="single" w:color="DDDDDD" w:sz="1"/>
+              <w:right w:val="single" w:color="DDDDDD" w:sz="1"/>
+            </w:tcBorders>
+            <w:shd w:fill="F8F9FF" w:val="clear"/>
+            <w:tcMar>
+              <w:top w:type="dxa" w:w="80"/>
+              <w:left w:type="dxa" w:w="150"/>
+              <w:bottom w:type="dxa" w:w="80"/>
+              <w:right w:type="dxa" w:w="150"/>
+            </w:tcMar>
+          </w:tcPr>
+          <w:p>
+            <w:r>
+              <w:rPr>
+                <w:rFonts w:ascii="Arial" w:cs="Arial" w:eastAsia="Arial" w:hAnsi="Arial"/>
+                <w:color w:val="313338"/>
+                <w:sz w:val="20"/>
+                <w:szCs w:val="20"/>
+              </w:rPr>
+              <w:t xml:space="preserve">Bump desktop/package.json version, run npm run release:win with GH_TOKEN set</w:t>
+            </w:r>
+          </w:p>
+        </w:tc>
+      </w:tr>
+      <w:tr>
+        <w:tc>
+          <w:tcPr>
+            <w:tcW w:type="dxa" w:w="3800"/>
+            <w:tcBorders>
+              <w:top w:val="single" w:color="DDDDDD" w:sz="1"/>
+              <w:left w:val="single" w:color="DDDDDD" w:sz="1"/>
+              <w:bottom w:val="single" w:color="DDDDDD" w:sz="1"/>
+              <w:right w:val="single" w:color="DDDDDD" w:sz="1"/>
+            </w:tcBorders>
+            <w:shd w:fill="FFFFFF" w:val="clear"/>
+            <w:tcMar>
+              <w:top w:type="dxa" w:w="80"/>
+              <w:left w:type="dxa" w:w="150"/>
+              <w:bottom w:type="dxa" w:w="80"/>
+              <w:right w:type="dxa" w:w="150"/>
+            </w:tcMar>
+          </w:tcPr>
+          <w:p>
+            <w:r>
+              <w:rPr>
+                <w:rFonts w:ascii="Arial" w:cs="Arial" w:eastAsia="Arial" w:hAnsi="Arial"/>
+                <w:color w:val="313338"/>
+                <w:sz w:val="20"/>
+                <w:szCs w:val="20"/>
+              </w:rPr>
+              <w:t xml:space="preserve">View server logs</w:t>
+            </w:r>
+          </w:p>
+        </w:tc>
+        <w:tc>
+          <w:tcPr>
+            <w:tcW w:type="dxa" w:w="5560"/>
+            <w:tcBorders>
+              <w:top w:val="single" w:color="DDDDDD" w:sz="1"/>
+              <w:left w:val="single" w:color="DDDDDD" w:sz="1"/>
+              <w:bottom w:val="single" w:color="DDDDDD" w:sz="1"/>
+              <w:right w:val="single" w:color="DDDDDD" w:sz="1"/>
+            </w:tcBorders>
+            <w:shd w:fill="FFFFFF" w:val="clear"/>
+            <w:tcMar>
+              <w:top w:type="dxa" w:w="80"/>
+              <w:left w:type="dxa" w:w="150"/>
+              <w:bottom w:type="dxa" w:w="80"/>
+              <w:right w:type="dxa" w:w="150"/>
+            </w:tcMar>
+          </w:tcPr>
+          <w:p>
+            <w:r>
+              <w:rPr>
+                <w:rFonts w:ascii="Arial" w:cs="Arial" w:eastAsia="Arial" w:hAnsi="Arial"/>
+                <w:color w:val="313338"/>
+                <w:sz w:val="20"/>
+                <w:szCs w:val="20"/>
+              </w:rPr>
+              <w:t xml:space="preserve">Railway &gt; backend service &gt; Deployments &gt; View logs</w:t>
+            </w:r>
+          </w:p>
+        </w:tc>
+      </w:tr>
+      <w:tr>
+        <w:tc>
+          <w:tcPr>
+            <w:tcW w:type="dxa" w:w="3800"/>
+            <w:tcBorders>
+              <w:top w:val="single" w:color="DDDDDD" w:sz="1"/>
+              <w:left w:val="single" w:color="DDDDDD" w:sz="1"/>
+              <w:bottom w:val="single" w:color="DDDDDD" w:sz="1"/>
+              <w:right w:val="single" w:color="DDDDDD" w:sz="1"/>
+            </w:tcBorders>
+            <w:shd w:fill="F8F9FF" w:val="clear"/>
+            <w:tcMar>
+              <w:top w:type="dxa" w:w="80"/>
+              <w:left w:type="dxa" w:w="150"/>
+              <w:bottom w:type="dxa" w:w="80"/>
+              <w:right w:type="dxa" w:w="150"/>
+            </w:tcMar>
+          </w:tcPr>
+          <w:p>
+            <w:r>
+              <w:rPr>
+                <w:rFonts w:ascii="Arial" w:cs="Arial" w:eastAsia="Arial" w:hAnsi="Arial"/>
+                <w:color w:val="313338"/>
+                <w:sz w:val="20"/>
+                <w:szCs w:val="20"/>
+              </w:rPr>
               <w:t xml:space="preserve">Restart backend</w:t>
             </w:r>
           </w:p>
@@ -6661,7 +8190,7 @@
               <w:bottom w:val="single" w:color="DDDDDD" w:sz="1"/>
               <w:right w:val="single" w:color="DDDDDD" w:sz="1"/>
             </w:tcBorders>
-            <w:shd w:fill="FFFFFF" w:val="clear"/>
+            <w:shd w:fill="F8F9FF" w:val="clear"/>
             <w:tcMar>
               <w:top w:type="dxa" w:w="80"/>
               <w:left w:type="dxa" w:w="150"/>
@@ -6705,7 +8234,7 @@
           <w:sz w:val="28"/>
           <w:szCs w:val="28"/>
         </w:rPr>
-        <w:t xml:space="preserve">12. Troubleshooting</w:t>
+        <w:t xml:space="preserve">15. Troubleshooting</w:t>
       </w:r>
     </w:p>
     <w:tbl>
@@ -7335,6 +8864,186 @@
                 <w:szCs w:val="20"/>
               </w:rPr>
               <w:t xml:space="preserve">Refresh the page; check Railway backend logs for errors</w:t>
+            </w:r>
+          </w:p>
+        </w:tc>
+      </w:tr>
+      <w:tr>
+        <w:tc>
+          <w:tcPr>
+            <w:tcW w:type="dxa" w:w="3600"/>
+            <w:tcBorders>
+              <w:top w:val="single" w:color="DDDDDD" w:sz="1"/>
+              <w:left w:val="single" w:color="DDDDDD" w:sz="1"/>
+              <w:bottom w:val="single" w:color="DDDDDD" w:sz="1"/>
+              <w:right w:val="single" w:color="DDDDDD" w:sz="1"/>
+            </w:tcBorders>
+            <w:shd w:fill="F8F9FF" w:val="clear"/>
+            <w:tcMar>
+              <w:top w:type="dxa" w:w="80"/>
+              <w:left w:type="dxa" w:w="150"/>
+              <w:bottom w:type="dxa" w:w="80"/>
+              <w:right w:type="dxa" w:w="150"/>
+            </w:tcMar>
+          </w:tcPr>
+          <w:p>
+            <w:r>
+              <w:rPr>
+                <w:rFonts w:ascii="Arial" w:cs="Arial" w:eastAsia="Arial" w:hAnsi="Arial"/>
+                <w:color w:val="313338"/>
+                <w:sz w:val="20"/>
+                <w:szCs w:val="20"/>
+              </w:rPr>
+              <w:t xml:space="preserve">Users not getting push notifications</w:t>
+            </w:r>
+          </w:p>
+        </w:tc>
+        <w:tc>
+          <w:tcPr>
+            <w:tcW w:type="dxa" w:w="5760"/>
+            <w:tcBorders>
+              <w:top w:val="single" w:color="DDDDDD" w:sz="1"/>
+              <w:left w:val="single" w:color="DDDDDD" w:sz="1"/>
+              <w:bottom w:val="single" w:color="DDDDDD" w:sz="1"/>
+              <w:right w:val="single" w:color="DDDDDD" w:sz="1"/>
+            </w:tcBorders>
+            <w:shd w:fill="F8F9FF" w:val="clear"/>
+            <w:tcMar>
+              <w:top w:type="dxa" w:w="80"/>
+              <w:left w:type="dxa" w:w="150"/>
+              <w:bottom w:type="dxa" w:w="80"/>
+              <w:right w:type="dxa" w:w="150"/>
+            </w:tcMar>
+          </w:tcPr>
+          <w:p>
+            <w:r>
+              <w:rPr>
+                <w:rFonts w:ascii="Arial" w:cs="Arial" w:eastAsia="Arial" w:hAnsi="Arial"/>
+                <w:color w:val="313338"/>
+                <w:sz w:val="20"/>
+                <w:szCs w:val="20"/>
+              </w:rPr>
+              <w:t xml:space="preserve">Verify VAPID_PUBLIC_KEY / VAPID_PRIVATE_KEY / VAPID_SUBJECT are set in Railway backend Variables</w:t>
+            </w:r>
+          </w:p>
+        </w:tc>
+      </w:tr>
+      <w:tr>
+        <w:tc>
+          <w:tcPr>
+            <w:tcW w:type="dxa" w:w="3600"/>
+            <w:tcBorders>
+              <w:top w:val="single" w:color="DDDDDD" w:sz="1"/>
+              <w:left w:val="single" w:color="DDDDDD" w:sz="1"/>
+              <w:bottom w:val="single" w:color="DDDDDD" w:sz="1"/>
+              <w:right w:val="single" w:color="DDDDDD" w:sz="1"/>
+            </w:tcBorders>
+            <w:shd w:fill="FFFFFF" w:val="clear"/>
+            <w:tcMar>
+              <w:top w:type="dxa" w:w="80"/>
+              <w:left w:type="dxa" w:w="150"/>
+              <w:bottom w:type="dxa" w:w="80"/>
+              <w:right w:type="dxa" w:w="150"/>
+            </w:tcMar>
+          </w:tcPr>
+          <w:p>
+            <w:r>
+              <w:rPr>
+                <w:rFonts w:ascii="Arial" w:cs="Arial" w:eastAsia="Arial" w:hAnsi="Arial"/>
+                <w:color w:val="313338"/>
+                <w:sz w:val="20"/>
+                <w:szCs w:val="20"/>
+              </w:rPr>
+              <w:t xml:space="preserve">Link previews / images blocked in console (CSP)</w:t>
+            </w:r>
+          </w:p>
+        </w:tc>
+        <w:tc>
+          <w:tcPr>
+            <w:tcW w:type="dxa" w:w="5760"/>
+            <w:tcBorders>
+              <w:top w:val="single" w:color="DDDDDD" w:sz="1"/>
+              <w:left w:val="single" w:color="DDDDDD" w:sz="1"/>
+              <w:bottom w:val="single" w:color="DDDDDD" w:sz="1"/>
+              <w:right w:val="single" w:color="DDDDDD" w:sz="1"/>
+            </w:tcBorders>
+            <w:shd w:fill="FFFFFF" w:val="clear"/>
+            <w:tcMar>
+              <w:top w:type="dxa" w:w="80"/>
+              <w:left w:type="dxa" w:w="150"/>
+              <w:bottom w:type="dxa" w:w="80"/>
+              <w:right w:type="dxa" w:w="150"/>
+            </w:tcMar>
+          </w:tcPr>
+          <w:p>
+            <w:r>
+              <w:rPr>
+                <w:rFonts w:ascii="Arial" w:cs="Arial" w:eastAsia="Arial" w:hAnsi="Arial"/>
+                <w:color w:val="313338"/>
+                <w:sz w:val="20"/>
+                <w:szCs w:val="20"/>
+              </w:rPr>
+              <w:t xml:space="preserve">Check the Content-Security-Policy in frontend/serve.js allows the domain in question</w:t>
+            </w:r>
+          </w:p>
+        </w:tc>
+      </w:tr>
+      <w:tr>
+        <w:tc>
+          <w:tcPr>
+            <w:tcW w:type="dxa" w:w="3600"/>
+            <w:tcBorders>
+              <w:top w:val="single" w:color="DDDDDD" w:sz="1"/>
+              <w:left w:val="single" w:color="DDDDDD" w:sz="1"/>
+              <w:bottom w:val="single" w:color="DDDDDD" w:sz="1"/>
+              <w:right w:val="single" w:color="DDDDDD" w:sz="1"/>
+            </w:tcBorders>
+            <w:shd w:fill="F8F9FF" w:val="clear"/>
+            <w:tcMar>
+              <w:top w:type="dxa" w:w="80"/>
+              <w:left w:type="dxa" w:w="150"/>
+              <w:bottom w:type="dxa" w:w="80"/>
+              <w:right w:type="dxa" w:w="150"/>
+            </w:tcMar>
+          </w:tcPr>
+          <w:p>
+            <w:r>
+              <w:rPr>
+                <w:rFonts w:ascii="Arial" w:cs="Arial" w:eastAsia="Arial" w:hAnsi="Arial"/>
+                <w:color w:val="313338"/>
+                <w:sz w:val="20"/>
+                <w:szCs w:val="20"/>
+              </w:rPr>
+              <w:t xml:space="preserve">Desktop release publish fails</w:t>
+            </w:r>
+          </w:p>
+        </w:tc>
+        <w:tc>
+          <w:tcPr>
+            <w:tcW w:type="dxa" w:w="5760"/>
+            <w:tcBorders>
+              <w:top w:val="single" w:color="DDDDDD" w:sz="1"/>
+              <w:left w:val="single" w:color="DDDDDD" w:sz="1"/>
+              <w:bottom w:val="single" w:color="DDDDDD" w:sz="1"/>
+              <w:right w:val="single" w:color="DDDDDD" w:sz="1"/>
+            </w:tcBorders>
+            <w:shd w:fill="F8F9FF" w:val="clear"/>
+            <w:tcMar>
+              <w:top w:type="dxa" w:w="80"/>
+              <w:left w:type="dxa" w:w="150"/>
+              <w:bottom w:type="dxa" w:w="80"/>
+              <w:right w:type="dxa" w:w="150"/>
+            </w:tcMar>
+          </w:tcPr>
+          <w:p>
+            <w:r>
+              <w:rPr>
+                <w:rFonts w:ascii="Arial" w:cs="Arial" w:eastAsia="Arial" w:hAnsi="Arial"/>
+                <w:color w:val="313338"/>
+                <w:sz w:val="20"/>
+                <w:szCs w:val="20"/>
+              </w:rPr>
+              <w:t xml:space="preserve">Confirm GH_TOKEN has repo scope and hasn’t expired; Linux builds need WSL/Docker (see Section 13)</w:t>
             </w:r>
           </w:p>
         </w:tc>

</xml_diff>

<commit_message>
Add password-reset log fallback when email is unavailable
Accounts & Identity round 5 (final): if RESEND_API_KEY is unset, or an
actual send fails (bad key, Resend outage, etc.), forgotPassword now
logs the same one-time reset link to the backend's console instead of
returning a hard error — previously this left every user with zero way
to recover their account whenever email delivery broke. Skips the
separate admin CLI script per the earlier decision, since it solves a
no-email-account scenario this app doesn't have and the web Admin
Portal already covers admin-assisted resets.

Also documents the fallback in the Admin Guide's troubleshooting table
(in-app viewer + regenerated .docx).
</commit_message>
<xml_diff>
--- a/CrowsNest-Admin-Guide.docx
+++ b/CrowsNest-Admin-Guide.docx
@@ -9044,6 +9044,66 @@
                 <w:szCs w:val="20"/>
               </w:rPr>
               <w:t xml:space="preserve">Confirm GH_TOKEN has repo scope and hasn’t expired; Linux builds need WSL/Docker (see Section 13)</w:t>
+            </w:r>
+          </w:p>
+        </w:tc>
+      </w:tr>
+      <w:tr>
+        <w:tc>
+          <w:tcPr>
+            <w:tcW w:type="dxa" w:w="3600"/>
+            <w:tcBorders>
+              <w:top w:val="single" w:color="DDDDDD" w:sz="1"/>
+              <w:left w:val="single" w:color="DDDDDD" w:sz="1"/>
+              <w:bottom w:val="single" w:color="DDDDDD" w:sz="1"/>
+              <w:right w:val="single" w:color="DDDDDD" w:sz="1"/>
+            </w:tcBorders>
+            <w:shd w:fill="FFFFFF" w:val="clear"/>
+            <w:tcMar>
+              <w:top w:type="dxa" w:w="80"/>
+              <w:left w:type="dxa" w:w="150"/>
+              <w:bottom w:type="dxa" w:w="80"/>
+              <w:right w:type="dxa" w:w="150"/>
+            </w:tcMar>
+          </w:tcPr>
+          <w:p>
+            <w:r>
+              <w:rPr>
+                <w:rFonts w:ascii="Arial" w:cs="Arial" w:eastAsia="Arial" w:hAnsi="Arial"/>
+                <w:color w:val="313338"/>
+                <w:sz w:val="20"/>
+                <w:szCs w:val="20"/>
+              </w:rPr>
+              <w:t xml:space="preserve">User says they never got a password reset email</w:t>
+            </w:r>
+          </w:p>
+        </w:tc>
+        <w:tc>
+          <w:tcPr>
+            <w:tcW w:type="dxa" w:w="5760"/>
+            <w:tcBorders>
+              <w:top w:val="single" w:color="DDDDDD" w:sz="1"/>
+              <w:left w:val="single" w:color="DDDDDD" w:sz="1"/>
+              <w:bottom w:val="single" w:color="DDDDDD" w:sz="1"/>
+              <w:right w:val="single" w:color="DDDDDD" w:sz="1"/>
+            </w:tcBorders>
+            <w:shd w:fill="FFFFFF" w:val="clear"/>
+            <w:tcMar>
+              <w:top w:type="dxa" w:w="80"/>
+              <w:left w:type="dxa" w:w="150"/>
+              <w:bottom w:type="dxa" w:w="80"/>
+              <w:right w:type="dxa" w:w="150"/>
+            </w:tcMar>
+          </w:tcPr>
+          <w:p>
+            <w:r>
+              <w:rPr>
+                <w:rFonts w:ascii="Arial" w:cs="Arial" w:eastAsia="Arial" w:hAnsi="Arial"/>
+                <w:color w:val="313338"/>
+                <w:sz w:val="20"/>
+                <w:szCs w:val="20"/>
+              </w:rPr>
+              <w:t xml:space="preserve">If RESEND_API_KEY is unset or the send fails, the reset link is printed to the backend’s Railway logs instead — search logs for "password-reset"</w:t>
             </w:r>
           </w:p>
         </w:tc>

</xml_diff>